<commit_message>
Point Netlify proxy at the Render API
Co-Authored-By: Claude Opus 5.5 <noreply@anthropic.com>
</commit_message>
<xml_diff>
--- a/docs/3_Development_Report.docx
+++ b/docs/3_Development_Report.docx
@@ -143,12 +143,6 @@
         <w:gridCol w:w="3482"/>
       </w:tblGrid>
       <w:tr>
-        <w:tblPrEx>
-          <w:tblCellMar>
-            <w:top w:w="0" w:type="dxa"/>
-            <w:bottom w:w="0" w:type="dxa"/>
-          </w:tblCellMar>
-        </w:tblPrEx>
         <w:trPr>
           <w:tblHeader/>
         </w:trPr>
@@ -294,12 +288,6 @@
         </w:tc>
       </w:tr>
       <w:tr>
-        <w:tblPrEx>
-          <w:tblCellMar>
-            <w:top w:w="0" w:type="dxa"/>
-            <w:bottom w:w="0" w:type="dxa"/>
-          </w:tblCellMar>
-        </w:tblPrEx>
         <w:trPr>
           <w:cantSplit/>
         </w:trPr>
@@ -429,12 +417,6 @@
         </w:tc>
       </w:tr>
       <w:tr>
-        <w:tblPrEx>
-          <w:tblCellMar>
-            <w:top w:w="0" w:type="dxa"/>
-            <w:bottom w:w="0" w:type="dxa"/>
-          </w:tblCellMar>
-        </w:tblPrEx>
         <w:trPr>
           <w:cantSplit/>
         </w:trPr>
@@ -568,12 +550,6 @@
         </w:tc>
       </w:tr>
       <w:tr>
-        <w:tblPrEx>
-          <w:tblCellMar>
-            <w:top w:w="0" w:type="dxa"/>
-            <w:bottom w:w="0" w:type="dxa"/>
-          </w:tblCellMar>
-        </w:tblPrEx>
         <w:trPr>
           <w:cantSplit/>
         </w:trPr>
@@ -703,12 +679,6 @@
         </w:tc>
       </w:tr>
       <w:tr>
-        <w:tblPrEx>
-          <w:tblCellMar>
-            <w:top w:w="0" w:type="dxa"/>
-            <w:bottom w:w="0" w:type="dxa"/>
-          </w:tblCellMar>
-        </w:tblPrEx>
         <w:trPr>
           <w:cantSplit/>
         </w:trPr>
@@ -842,12 +812,6 @@
         </w:tc>
       </w:tr>
       <w:tr>
-        <w:tblPrEx>
-          <w:tblCellMar>
-            <w:top w:w="0" w:type="dxa"/>
-            <w:bottom w:w="0" w:type="dxa"/>
-          </w:tblCellMar>
-        </w:tblPrEx>
         <w:trPr>
           <w:cantSplit/>
         </w:trPr>
@@ -1000,13 +964,14 @@
           <w:sz w:val="32"/>
           <w:szCs w:val="32"/>
         </w:rPr>
+        <w:lastRenderedPageBreak/>
         <w:t>Contents</w:t>
       </w:r>
     </w:p>
     <w:sdt>
       <w:sdtPr>
         <w:alias w:val="Contents"/>
-        <w:id w:val="2028443011"/>
+        <w:id w:val="1783144497"/>
       </w:sdtPr>
       <w:sdtEndPr/>
       <w:sdtContent>
@@ -1034,7 +999,7 @@
           <w:r>
             <w:fldChar w:fldCharType="separate"/>
           </w:r>
-          <w:hyperlink w:anchor="_Toc242087217" w:history="1">
+          <w:hyperlink w:anchor="_Toc242087303" w:history="1">
             <w:r>
               <w:rPr>
                 <w:rStyle w:val="Hyperlink"/>
@@ -1058,7 +1023,7 @@
               <w:rPr>
                 <w:noProof/>
               </w:rPr>
-              <w:instrText xml:space="preserve"> PAGEREF _Toc242087217 \h </w:instrText>
+              <w:instrText xml:space="preserve"> PAGEREF _Toc242087303 \h </w:instrText>
             </w:r>
             <w:r>
               <w:rPr>
@@ -1100,7 +1065,7 @@
               <w14:ligatures w14:val="standardContextual"/>
             </w:rPr>
           </w:pPr>
-          <w:hyperlink w:anchor="_Toc242087218" w:history="1">
+          <w:hyperlink w:anchor="_Toc242087304" w:history="1">
             <w:r>
               <w:rPr>
                 <w:rStyle w:val="Hyperlink"/>
@@ -1124,7 +1089,7 @@
               <w:rPr>
                 <w:noProof/>
               </w:rPr>
-              <w:instrText xml:space="preserve"> PAGEREF _Toc242087218 \h </w:instrText>
+              <w:instrText xml:space="preserve"> PAGEREF _Toc242087304 \h </w:instrText>
             </w:r>
             <w:r>
               <w:rPr>
@@ -1166,7 +1131,7 @@
               <w14:ligatures w14:val="standardContextual"/>
             </w:rPr>
           </w:pPr>
-          <w:hyperlink w:anchor="_Toc242087219" w:history="1">
+          <w:hyperlink w:anchor="_Toc242087305" w:history="1">
             <w:r>
               <w:rPr>
                 <w:rStyle w:val="Hyperlink"/>
@@ -1190,7 +1155,7 @@
               <w:rPr>
                 <w:noProof/>
               </w:rPr>
-              <w:instrText xml:space="preserve"> PAGEREF _Toc242087219 \h </w:instrText>
+              <w:instrText xml:space="preserve"> PAGEREF _Toc242087305 \h </w:instrText>
             </w:r>
             <w:r>
               <w:rPr>
@@ -1232,7 +1197,7 @@
               <w14:ligatures w14:val="standardContextual"/>
             </w:rPr>
           </w:pPr>
-          <w:hyperlink w:anchor="_Toc242087220" w:history="1">
+          <w:hyperlink w:anchor="_Toc242087306" w:history="1">
             <w:r>
               <w:rPr>
                 <w:rStyle w:val="Hyperlink"/>
@@ -1256,7 +1221,7 @@
               <w:rPr>
                 <w:noProof/>
               </w:rPr>
-              <w:instrText xml:space="preserve"> PAGEREF _Toc242087220 \h </w:instrText>
+              <w:instrText xml:space="preserve"> PAGEREF _Toc242087306 \h </w:instrText>
             </w:r>
             <w:r>
               <w:rPr>
@@ -1298,7 +1263,7 @@
               <w14:ligatures w14:val="standardContextual"/>
             </w:rPr>
           </w:pPr>
-          <w:hyperlink w:anchor="_Toc242087221" w:history="1">
+          <w:hyperlink w:anchor="_Toc242087307" w:history="1">
             <w:r>
               <w:rPr>
                 <w:rStyle w:val="Hyperlink"/>
@@ -1322,7 +1287,7 @@
               <w:rPr>
                 <w:noProof/>
               </w:rPr>
-              <w:instrText xml:space="preserve"> PAGEREF _Toc242087221 \h </w:instrText>
+              <w:instrText xml:space="preserve"> PAGEREF _Toc242087307 \h </w:instrText>
             </w:r>
             <w:r>
               <w:rPr>
@@ -1364,7 +1329,7 @@
               <w14:ligatures w14:val="standardContextual"/>
             </w:rPr>
           </w:pPr>
-          <w:hyperlink w:anchor="_Toc242087222" w:history="1">
+          <w:hyperlink w:anchor="_Toc242087308" w:history="1">
             <w:r>
               <w:rPr>
                 <w:rStyle w:val="Hyperlink"/>
@@ -1388,7 +1353,7 @@
               <w:rPr>
                 <w:noProof/>
               </w:rPr>
-              <w:instrText xml:space="preserve"> PAGEREF _Toc242087222 \h </w:instrText>
+              <w:instrText xml:space="preserve"> PAGEREF _Toc242087308 \h </w:instrText>
             </w:r>
             <w:r>
               <w:rPr>
@@ -1430,7 +1395,7 @@
               <w14:ligatures w14:val="standardContextual"/>
             </w:rPr>
           </w:pPr>
-          <w:hyperlink w:anchor="_Toc242087223" w:history="1">
+          <w:hyperlink w:anchor="_Toc242087309" w:history="1">
             <w:r>
               <w:rPr>
                 <w:rStyle w:val="Hyperlink"/>
@@ -1454,7 +1419,7 @@
               <w:rPr>
                 <w:noProof/>
               </w:rPr>
-              <w:instrText xml:space="preserve"> PAGEREF _Toc242087223 \h </w:instrText>
+              <w:instrText xml:space="preserve"> PAGEREF _Toc242087309 \h </w:instrText>
             </w:r>
             <w:r>
               <w:rPr>
@@ -1496,7 +1461,7 @@
               <w14:ligatures w14:val="standardContextual"/>
             </w:rPr>
           </w:pPr>
-          <w:hyperlink w:anchor="_Toc242087224" w:history="1">
+          <w:hyperlink w:anchor="_Toc242087310" w:history="1">
             <w:r>
               <w:rPr>
                 <w:rStyle w:val="Hyperlink"/>
@@ -1520,7 +1485,7 @@
               <w:rPr>
                 <w:noProof/>
               </w:rPr>
-              <w:instrText xml:space="preserve"> PAGEREF _Toc242087224 \h </w:instrText>
+              <w:instrText xml:space="preserve"> PAGEREF _Toc242087310 \h </w:instrText>
             </w:r>
             <w:r>
               <w:rPr>
@@ -1562,7 +1527,7 @@
               <w14:ligatures w14:val="standardContextual"/>
             </w:rPr>
           </w:pPr>
-          <w:hyperlink w:anchor="_Toc242087225" w:history="1">
+          <w:hyperlink w:anchor="_Toc242087311" w:history="1">
             <w:r>
               <w:rPr>
                 <w:rStyle w:val="Hyperlink"/>
@@ -1586,7 +1551,7 @@
               <w:rPr>
                 <w:noProof/>
               </w:rPr>
-              <w:instrText xml:space="preserve"> PAGEREF _Toc242087225 \h </w:instrText>
+              <w:instrText xml:space="preserve"> PAGEREF _Toc242087311 \h </w:instrText>
             </w:r>
             <w:r>
               <w:rPr>
@@ -1603,7 +1568,7 @@
               <w:rPr>
                 <w:noProof/>
               </w:rPr>
-              <w:t>7</w:t>
+              <w:t>8</w:t>
             </w:r>
             <w:r>
               <w:rPr>
@@ -1628,7 +1593,7 @@
               <w14:ligatures w14:val="standardContextual"/>
             </w:rPr>
           </w:pPr>
-          <w:hyperlink w:anchor="_Toc242087226" w:history="1">
+          <w:hyperlink w:anchor="_Toc242087312" w:history="1">
             <w:r>
               <w:rPr>
                 <w:rStyle w:val="Hyperlink"/>
@@ -1652,7 +1617,7 @@
               <w:rPr>
                 <w:noProof/>
               </w:rPr>
-              <w:instrText xml:space="preserve"> PAGEREF _Toc242087226 \h </w:instrText>
+              <w:instrText xml:space="preserve"> PAGEREF _Toc242087312 \h </w:instrText>
             </w:r>
             <w:r>
               <w:rPr>
@@ -1694,7 +1659,7 @@
               <w14:ligatures w14:val="standardContextual"/>
             </w:rPr>
           </w:pPr>
-          <w:hyperlink w:anchor="_Toc242087227" w:history="1">
+          <w:hyperlink w:anchor="_Toc242087313" w:history="1">
             <w:r>
               <w:rPr>
                 <w:rStyle w:val="Hyperlink"/>
@@ -1718,7 +1683,7 @@
               <w:rPr>
                 <w:noProof/>
               </w:rPr>
-              <w:instrText xml:space="preserve"> PAGEREF _Toc242087227 \h </w:instrText>
+              <w:instrText xml:space="preserve"> PAGEREF _Toc242087313 \h </w:instrText>
             </w:r>
             <w:r>
               <w:rPr>
@@ -1760,7 +1725,7 @@
               <w14:ligatures w14:val="standardContextual"/>
             </w:rPr>
           </w:pPr>
-          <w:hyperlink w:anchor="_Toc242087228" w:history="1">
+          <w:hyperlink w:anchor="_Toc242087314" w:history="1">
             <w:r>
               <w:rPr>
                 <w:rStyle w:val="Hyperlink"/>
@@ -1784,7 +1749,7 @@
               <w:rPr>
                 <w:noProof/>
               </w:rPr>
-              <w:instrText xml:space="preserve"> PAGEREF _Toc242087228 \h </w:instrText>
+              <w:instrText xml:space="preserve"> PAGEREF _Toc242087314 \h </w:instrText>
             </w:r>
             <w:r>
               <w:rPr>
@@ -1826,7 +1791,7 @@
               <w14:ligatures w14:val="standardContextual"/>
             </w:rPr>
           </w:pPr>
-          <w:hyperlink w:anchor="_Toc242087229" w:history="1">
+          <w:hyperlink w:anchor="_Toc242087315" w:history="1">
             <w:r>
               <w:rPr>
                 <w:rStyle w:val="Hyperlink"/>
@@ -1850,7 +1815,7 @@
               <w:rPr>
                 <w:noProof/>
               </w:rPr>
-              <w:instrText xml:space="preserve"> PAGEREF _Toc242087229 \h </w:instrText>
+              <w:instrText xml:space="preserve"> PAGEREF _Toc242087315 \h </w:instrText>
             </w:r>
             <w:r>
               <w:rPr>
@@ -1892,7 +1857,7 @@
               <w14:ligatures w14:val="standardContextual"/>
             </w:rPr>
           </w:pPr>
-          <w:hyperlink w:anchor="_Toc242087230" w:history="1">
+          <w:hyperlink w:anchor="_Toc242087316" w:history="1">
             <w:r>
               <w:rPr>
                 <w:rStyle w:val="Hyperlink"/>
@@ -1916,7 +1881,7 @@
               <w:rPr>
                 <w:noProof/>
               </w:rPr>
-              <w:instrText xml:space="preserve"> PAGEREF _Toc242087230 \h </w:instrText>
+              <w:instrText xml:space="preserve"> PAGEREF _Toc242087316 \h </w:instrText>
             </w:r>
             <w:r>
               <w:rPr>
@@ -1958,7 +1923,7 @@
               <w14:ligatures w14:val="standardContextual"/>
             </w:rPr>
           </w:pPr>
-          <w:hyperlink w:anchor="_Toc242087231" w:history="1">
+          <w:hyperlink w:anchor="_Toc242087359" w:history="1">
             <w:r>
               <w:rPr>
                 <w:rStyle w:val="Hyperlink"/>
@@ -1982,7 +1947,7 @@
               <w:rPr>
                 <w:noProof/>
               </w:rPr>
-              <w:instrText xml:space="preserve"> PAGEREF _Toc242087231 \h </w:instrText>
+              <w:instrText xml:space="preserve"> PAGEREF _Toc242087359 \h </w:instrText>
             </w:r>
             <w:r>
               <w:rPr>
@@ -2024,7 +1989,7 @@
               <w14:ligatures w14:val="standardContextual"/>
             </w:rPr>
           </w:pPr>
-          <w:hyperlink w:anchor="_Toc242087232" w:history="1">
+          <w:hyperlink w:anchor="_Toc242087360" w:history="1">
             <w:r>
               <w:rPr>
                 <w:rStyle w:val="Hyperlink"/>
@@ -2048,7 +2013,7 @@
               <w:rPr>
                 <w:noProof/>
               </w:rPr>
-              <w:instrText xml:space="preserve"> PAGEREF _Toc242087232 \h </w:instrText>
+              <w:instrText xml:space="preserve"> PAGEREF _Toc242087360 \h </w:instrText>
             </w:r>
             <w:r>
               <w:rPr>
@@ -2090,7 +2055,7 @@
               <w14:ligatures w14:val="standardContextual"/>
             </w:rPr>
           </w:pPr>
-          <w:hyperlink w:anchor="_Toc242087233" w:history="1">
+          <w:hyperlink w:anchor="_Toc242087361" w:history="1">
             <w:r>
               <w:rPr>
                 <w:rStyle w:val="Hyperlink"/>
@@ -2114,7 +2079,7 @@
               <w:rPr>
                 <w:noProof/>
               </w:rPr>
-              <w:instrText xml:space="preserve"> PAGEREF _Toc242087233 \h </w:instrText>
+              <w:instrText xml:space="preserve"> PAGEREF _Toc242087361 \h </w:instrText>
             </w:r>
             <w:r>
               <w:rPr>
@@ -2156,7 +2121,7 @@
               <w14:ligatures w14:val="standardContextual"/>
             </w:rPr>
           </w:pPr>
-          <w:hyperlink w:anchor="_Toc242087234" w:history="1">
+          <w:hyperlink w:anchor="_Toc242087362" w:history="1">
             <w:r>
               <w:rPr>
                 <w:rStyle w:val="Hyperlink"/>
@@ -2180,7 +2145,7 @@
               <w:rPr>
                 <w:noProof/>
               </w:rPr>
-              <w:instrText xml:space="preserve"> PAGEREF _Toc242087234 \h </w:instrText>
+              <w:instrText xml:space="preserve"> PAGEREF _Toc242087362 \h </w:instrText>
             </w:r>
             <w:r>
               <w:rPr>
@@ -2222,7 +2187,7 @@
               <w14:ligatures w14:val="standardContextual"/>
             </w:rPr>
           </w:pPr>
-          <w:hyperlink w:anchor="_Toc242087235" w:history="1">
+          <w:hyperlink w:anchor="_Toc242087363" w:history="1">
             <w:r>
               <w:rPr>
                 <w:rStyle w:val="Hyperlink"/>
@@ -2246,7 +2211,7 @@
               <w:rPr>
                 <w:noProof/>
               </w:rPr>
-              <w:instrText xml:space="preserve"> PAGEREF _Toc242087235 \h </w:instrText>
+              <w:instrText xml:space="preserve"> PAGEREF _Toc242087363 \h </w:instrText>
             </w:r>
             <w:r>
               <w:rPr>
@@ -2288,7 +2253,7 @@
               <w14:ligatures w14:val="standardContextual"/>
             </w:rPr>
           </w:pPr>
-          <w:hyperlink w:anchor="_Toc242087236" w:history="1">
+          <w:hyperlink w:anchor="_Toc242087364" w:history="1">
             <w:r>
               <w:rPr>
                 <w:rStyle w:val="Hyperlink"/>
@@ -2312,7 +2277,7 @@
               <w:rPr>
                 <w:noProof/>
               </w:rPr>
-              <w:instrText xml:space="preserve"> PAGEREF _Toc242087236 \h </w:instrText>
+              <w:instrText xml:space="preserve"> PAGEREF _Toc242087364 \h </w:instrText>
             </w:r>
             <w:r>
               <w:rPr>
@@ -2354,7 +2319,7 @@
               <w14:ligatures w14:val="standardContextual"/>
             </w:rPr>
           </w:pPr>
-          <w:hyperlink w:anchor="_Toc242087237" w:history="1">
+          <w:hyperlink w:anchor="_Toc242087365" w:history="1">
             <w:r>
               <w:rPr>
                 <w:rStyle w:val="Hyperlink"/>
@@ -2378,7 +2343,7 @@
               <w:rPr>
                 <w:noProof/>
               </w:rPr>
-              <w:instrText xml:space="preserve"> PAGEREF _Toc242087237 \h </w:instrText>
+              <w:instrText xml:space="preserve"> PAGEREF _Toc242087365 \h </w:instrText>
             </w:r>
             <w:r>
               <w:rPr>
@@ -2420,7 +2385,7 @@
               <w14:ligatures w14:val="standardContextual"/>
             </w:rPr>
           </w:pPr>
-          <w:hyperlink w:anchor="_Toc242087238" w:history="1">
+          <w:hyperlink w:anchor="_Toc242087366" w:history="1">
             <w:r>
               <w:rPr>
                 <w:rStyle w:val="Hyperlink"/>
@@ -2444,7 +2409,7 @@
               <w:rPr>
                 <w:noProof/>
               </w:rPr>
-              <w:instrText xml:space="preserve"> PAGEREF _Toc242087238 \h </w:instrText>
+              <w:instrText xml:space="preserve"> PAGEREF _Toc242087366 \h </w:instrText>
             </w:r>
             <w:r>
               <w:rPr>
@@ -2486,7 +2451,7 @@
               <w14:ligatures w14:val="standardContextual"/>
             </w:rPr>
           </w:pPr>
-          <w:hyperlink w:anchor="_Toc242087239" w:history="1">
+          <w:hyperlink w:anchor="_Toc242087367" w:history="1">
             <w:r>
               <w:rPr>
                 <w:rStyle w:val="Hyperlink"/>
@@ -2510,7 +2475,7 @@
               <w:rPr>
                 <w:noProof/>
               </w:rPr>
-              <w:instrText xml:space="preserve"> PAGEREF _Toc242087239 \h </w:instrText>
+              <w:instrText xml:space="preserve"> PAGEREF _Toc242087367 \h </w:instrText>
             </w:r>
             <w:r>
               <w:rPr>
@@ -2552,7 +2517,7 @@
               <w14:ligatures w14:val="standardContextual"/>
             </w:rPr>
           </w:pPr>
-          <w:hyperlink w:anchor="_Toc242087240" w:history="1">
+          <w:hyperlink w:anchor="_Toc242087368" w:history="1">
             <w:r>
               <w:rPr>
                 <w:rStyle w:val="Hyperlink"/>
@@ -2576,7 +2541,7 @@
               <w:rPr>
                 <w:noProof/>
               </w:rPr>
-              <w:instrText xml:space="preserve"> PAGEREF _Toc242087240 \h </w:instrText>
+              <w:instrText xml:space="preserve"> PAGEREF _Toc242087368 \h </w:instrText>
             </w:r>
             <w:r>
               <w:rPr>
@@ -2618,7 +2583,7 @@
               <w14:ligatures w14:val="standardContextual"/>
             </w:rPr>
           </w:pPr>
-          <w:hyperlink w:anchor="_Toc242087241" w:history="1">
+          <w:hyperlink w:anchor="_Toc242087369" w:history="1">
             <w:r>
               <w:rPr>
                 <w:rStyle w:val="Hyperlink"/>
@@ -2642,7 +2607,7 @@
               <w:rPr>
                 <w:noProof/>
               </w:rPr>
-              <w:instrText xml:space="preserve"> PAGEREF _Toc242087241 \h </w:instrText>
+              <w:instrText xml:space="preserve"> PAGEREF _Toc242087369 \h </w:instrText>
             </w:r>
             <w:r>
               <w:rPr>
@@ -2684,7 +2649,7 @@
               <w14:ligatures w14:val="standardContextual"/>
             </w:rPr>
           </w:pPr>
-          <w:hyperlink w:anchor="_Toc242087242" w:history="1">
+          <w:hyperlink w:anchor="_Toc242087370" w:history="1">
             <w:r>
               <w:rPr>
                 <w:rStyle w:val="Hyperlink"/>
@@ -2708,7 +2673,7 @@
               <w:rPr>
                 <w:noProof/>
               </w:rPr>
-              <w:instrText xml:space="preserve"> PAGEREF _Toc242087242 \h </w:instrText>
+              <w:instrText xml:space="preserve"> PAGEREF _Toc242087370 \h </w:instrText>
             </w:r>
             <w:r>
               <w:rPr>
@@ -2750,7 +2715,7 @@
               <w14:ligatures w14:val="standardContextual"/>
             </w:rPr>
           </w:pPr>
-          <w:hyperlink w:anchor="_Toc242087243" w:history="1">
+          <w:hyperlink w:anchor="_Toc242087371" w:history="1">
             <w:r>
               <w:rPr>
                 <w:rStyle w:val="Hyperlink"/>
@@ -2774,7 +2739,7 @@
               <w:rPr>
                 <w:noProof/>
               </w:rPr>
-              <w:instrText xml:space="preserve"> PAGEREF _Toc242087243 \h </w:instrText>
+              <w:instrText xml:space="preserve"> PAGEREF _Toc242087371 \h </w:instrText>
             </w:r>
             <w:r>
               <w:rPr>
@@ -2816,7 +2781,7 @@
               <w14:ligatures w14:val="standardContextual"/>
             </w:rPr>
           </w:pPr>
-          <w:hyperlink w:anchor="_Toc242087244" w:history="1">
+          <w:hyperlink w:anchor="_Toc242087372" w:history="1">
             <w:r>
               <w:rPr>
                 <w:rStyle w:val="Hyperlink"/>
@@ -2840,7 +2805,7 @@
               <w:rPr>
                 <w:noProof/>
               </w:rPr>
-              <w:instrText xml:space="preserve"> PAGEREF _Toc242087244 \h </w:instrText>
+              <w:instrText xml:space="preserve"> PAGEREF _Toc242087372 \h </w:instrText>
             </w:r>
             <w:r>
               <w:rPr>
@@ -2882,7 +2847,7 @@
               <w14:ligatures w14:val="standardContextual"/>
             </w:rPr>
           </w:pPr>
-          <w:hyperlink w:anchor="_Toc242087245" w:history="1">
+          <w:hyperlink w:anchor="_Toc242087373" w:history="1">
             <w:r>
               <w:rPr>
                 <w:rStyle w:val="Hyperlink"/>
@@ -2906,7 +2871,7 @@
               <w:rPr>
                 <w:noProof/>
               </w:rPr>
-              <w:instrText xml:space="preserve"> PAGEREF _Toc242087245 \h </w:instrText>
+              <w:instrText xml:space="preserve"> PAGEREF _Toc242087373 \h </w:instrText>
             </w:r>
             <w:r>
               <w:rPr>
@@ -2948,7 +2913,7 @@
               <w14:ligatures w14:val="standardContextual"/>
             </w:rPr>
           </w:pPr>
-          <w:hyperlink w:anchor="_Toc242087246" w:history="1">
+          <w:hyperlink w:anchor="_Toc242087374" w:history="1">
             <w:r>
               <w:rPr>
                 <w:rStyle w:val="Hyperlink"/>
@@ -2972,7 +2937,7 @@
               <w:rPr>
                 <w:noProof/>
               </w:rPr>
-              <w:instrText xml:space="preserve"> PAGEREF _Toc242087246 \h </w:instrText>
+              <w:instrText xml:space="preserve"> PAGEREF _Toc242087374 \h </w:instrText>
             </w:r>
             <w:r>
               <w:rPr>
@@ -3014,7 +2979,7 @@
               <w14:ligatures w14:val="standardContextual"/>
             </w:rPr>
           </w:pPr>
-          <w:hyperlink w:anchor="_Toc242087247" w:history="1">
+          <w:hyperlink w:anchor="_Toc242087375" w:history="1">
             <w:r>
               <w:rPr>
                 <w:rStyle w:val="Hyperlink"/>
@@ -3038,7 +3003,7 @@
               <w:rPr>
                 <w:noProof/>
               </w:rPr>
-              <w:instrText xml:space="preserve"> PAGEREF _Toc242087247 \h </w:instrText>
+              <w:instrText xml:space="preserve"> PAGEREF _Toc242087375 \h </w:instrText>
             </w:r>
             <w:r>
               <w:rPr>
@@ -3080,7 +3045,7 @@
               <w14:ligatures w14:val="standardContextual"/>
             </w:rPr>
           </w:pPr>
-          <w:hyperlink w:anchor="_Toc242087248" w:history="1">
+          <w:hyperlink w:anchor="_Toc242087376" w:history="1">
             <w:r>
               <w:rPr>
                 <w:rStyle w:val="Hyperlink"/>
@@ -3104,7 +3069,7 @@
               <w:rPr>
                 <w:noProof/>
               </w:rPr>
-              <w:instrText xml:space="preserve"> PAGEREF _Toc242087248 \h </w:instrText>
+              <w:instrText xml:space="preserve"> PAGEREF _Toc242087376 \h </w:instrText>
             </w:r>
             <w:r>
               <w:rPr>
@@ -3146,7 +3111,7 @@
               <w14:ligatures w14:val="standardContextual"/>
             </w:rPr>
           </w:pPr>
-          <w:hyperlink w:anchor="_Toc242087249" w:history="1">
+          <w:hyperlink w:anchor="_Toc242087377" w:history="1">
             <w:r>
               <w:rPr>
                 <w:rStyle w:val="Hyperlink"/>
@@ -3170,7 +3135,7 @@
               <w:rPr>
                 <w:noProof/>
               </w:rPr>
-              <w:instrText xml:space="preserve"> PAGEREF _Toc242087249 \h </w:instrText>
+              <w:instrText xml:space="preserve"> PAGEREF _Toc242087377 \h </w:instrText>
             </w:r>
             <w:r>
               <w:rPr>
@@ -3212,7 +3177,7 @@
               <w14:ligatures w14:val="standardContextual"/>
             </w:rPr>
           </w:pPr>
-          <w:hyperlink w:anchor="_Toc242087250" w:history="1">
+          <w:hyperlink w:anchor="_Toc242087378" w:history="1">
             <w:r>
               <w:rPr>
                 <w:rStyle w:val="Hyperlink"/>
@@ -3236,7 +3201,7 @@
               <w:rPr>
                 <w:noProof/>
               </w:rPr>
-              <w:instrText xml:space="preserve"> PAGEREF _Toc242087250 \h </w:instrText>
+              <w:instrText xml:space="preserve"> PAGEREF _Toc242087378 \h </w:instrText>
             </w:r>
             <w:r>
               <w:rPr>
@@ -3278,7 +3243,7 @@
               <w14:ligatures w14:val="standardContextual"/>
             </w:rPr>
           </w:pPr>
-          <w:hyperlink w:anchor="_Toc242087251" w:history="1">
+          <w:hyperlink w:anchor="_Toc242087379" w:history="1">
             <w:r>
               <w:rPr>
                 <w:rStyle w:val="Hyperlink"/>
@@ -3302,7 +3267,7 @@
               <w:rPr>
                 <w:noProof/>
               </w:rPr>
-              <w:instrText xml:space="preserve"> PAGEREF _Toc242087251 \h </w:instrText>
+              <w:instrText xml:space="preserve"> PAGEREF _Toc242087379 \h </w:instrText>
             </w:r>
             <w:r>
               <w:rPr>
@@ -3344,7 +3309,7 @@
               <w14:ligatures w14:val="standardContextual"/>
             </w:rPr>
           </w:pPr>
-          <w:hyperlink w:anchor="_Toc242087252" w:history="1">
+          <w:hyperlink w:anchor="_Toc242087380" w:history="1">
             <w:r>
               <w:rPr>
                 <w:rStyle w:val="Hyperlink"/>
@@ -3368,7 +3333,7 @@
               <w:rPr>
                 <w:noProof/>
               </w:rPr>
-              <w:instrText xml:space="preserve"> PAGEREF _Toc242087252 \h </w:instrText>
+              <w:instrText xml:space="preserve"> PAGEREF _Toc242087380 \h </w:instrText>
             </w:r>
             <w:r>
               <w:rPr>
@@ -3410,7 +3375,7 @@
               <w14:ligatures w14:val="standardContextual"/>
             </w:rPr>
           </w:pPr>
-          <w:hyperlink w:anchor="_Toc242087253" w:history="1">
+          <w:hyperlink w:anchor="_Toc242087381" w:history="1">
             <w:r>
               <w:rPr>
                 <w:rStyle w:val="Hyperlink"/>
@@ -3434,7 +3399,7 @@
               <w:rPr>
                 <w:noProof/>
               </w:rPr>
-              <w:instrText xml:space="preserve"> PAGEREF _Toc242087253 \h </w:instrText>
+              <w:instrText xml:space="preserve"> PAGEREF _Toc242087381 \h </w:instrText>
             </w:r>
             <w:r>
               <w:rPr>
@@ -3476,7 +3441,7 @@
               <w14:ligatures w14:val="standardContextual"/>
             </w:rPr>
           </w:pPr>
-          <w:hyperlink w:anchor="_Toc242087254" w:history="1">
+          <w:hyperlink w:anchor="_Toc242087382" w:history="1">
             <w:r>
               <w:rPr>
                 <w:rStyle w:val="Hyperlink"/>
@@ -3500,7 +3465,7 @@
               <w:rPr>
                 <w:noProof/>
               </w:rPr>
-              <w:instrText xml:space="preserve"> PAGEREF _Toc242087254 \h </w:instrText>
+              <w:instrText xml:space="preserve"> PAGEREF _Toc242087382 \h </w:instrText>
             </w:r>
             <w:r>
               <w:rPr>
@@ -3542,7 +3507,7 @@
               <w14:ligatures w14:val="standardContextual"/>
             </w:rPr>
           </w:pPr>
-          <w:hyperlink w:anchor="_Toc242087255" w:history="1">
+          <w:hyperlink w:anchor="_Toc242087383" w:history="1">
             <w:r>
               <w:rPr>
                 <w:rStyle w:val="Hyperlink"/>
@@ -3566,7 +3531,7 @@
               <w:rPr>
                 <w:noProof/>
               </w:rPr>
-              <w:instrText xml:space="preserve"> PAGEREF _Toc242087255 \h </w:instrText>
+              <w:instrText xml:space="preserve"> PAGEREF _Toc242087383 \h </w:instrText>
             </w:r>
             <w:r>
               <w:rPr>
@@ -3608,7 +3573,7 @@
               <w14:ligatures w14:val="standardContextual"/>
             </w:rPr>
           </w:pPr>
-          <w:hyperlink w:anchor="_Toc242087256" w:history="1">
+          <w:hyperlink w:anchor="_Toc242087384" w:history="1">
             <w:r>
               <w:rPr>
                 <w:rStyle w:val="Hyperlink"/>
@@ -3632,7 +3597,7 @@
               <w:rPr>
                 <w:noProof/>
               </w:rPr>
-              <w:instrText xml:space="preserve"> PAGEREF _Toc242087256 \h </w:instrText>
+              <w:instrText xml:space="preserve"> PAGEREF _Toc242087384 \h </w:instrText>
             </w:r>
             <w:r>
               <w:rPr>
@@ -3674,7 +3639,7 @@
               <w14:ligatures w14:val="standardContextual"/>
             </w:rPr>
           </w:pPr>
-          <w:hyperlink w:anchor="_Toc242087257" w:history="1">
+          <w:hyperlink w:anchor="_Toc242087385" w:history="1">
             <w:r>
               <w:rPr>
                 <w:rStyle w:val="Hyperlink"/>
@@ -3698,7 +3663,7 @@
               <w:rPr>
                 <w:noProof/>
               </w:rPr>
-              <w:instrText xml:space="preserve"> PAGEREF _Toc242087257 \h </w:instrText>
+              <w:instrText xml:space="preserve"> PAGEREF _Toc242087385 \h </w:instrText>
             </w:r>
             <w:r>
               <w:rPr>
@@ -3740,7 +3705,7 @@
               <w14:ligatures w14:val="standardContextual"/>
             </w:rPr>
           </w:pPr>
-          <w:hyperlink w:anchor="_Toc242087258" w:history="1">
+          <w:hyperlink w:anchor="_Toc242087386" w:history="1">
             <w:r>
               <w:rPr>
                 <w:rStyle w:val="Hyperlink"/>
@@ -3764,7 +3729,7 @@
               <w:rPr>
                 <w:noProof/>
               </w:rPr>
-              <w:instrText xml:space="preserve"> PAGEREF _Toc242087258 \h </w:instrText>
+              <w:instrText xml:space="preserve"> PAGEREF _Toc242087386 \h </w:instrText>
             </w:r>
             <w:r>
               <w:rPr>
@@ -3803,7 +3768,7 @@
         <w:pStyle w:val="Heading1"/>
         <w:pageBreakBefore/>
       </w:pPr>
-      <w:bookmarkStart w:id="0" w:name="_Toc242087217"/>
+      <w:bookmarkStart w:id="0" w:name="_Toc242087303"/>
       <w:r>
         <w:t>1. Introduction</w:t>
       </w:r>
@@ -3821,7 +3786,7 @@
       <w:pPr>
         <w:pStyle w:val="Heading2"/>
       </w:pPr>
-      <w:bookmarkStart w:id="1" w:name="_Toc242087218"/>
+      <w:bookmarkStart w:id="1" w:name="_Toc242087304"/>
       <w:r>
         <w:t>1.1 What was built</w:t>
       </w:r>
@@ -3849,12 +3814,6 @@
         <w:gridCol w:w="6018"/>
       </w:tblGrid>
       <w:tr>
-        <w:tblPrEx>
-          <w:tblCellMar>
-            <w:top w:w="0" w:type="dxa"/>
-            <w:bottom w:w="0" w:type="dxa"/>
-          </w:tblCellMar>
-        </w:tblPrEx>
         <w:trPr>
           <w:tblHeader/>
         </w:trPr>
@@ -3930,12 +3889,6 @@
         </w:tc>
       </w:tr>
       <w:tr>
-        <w:tblPrEx>
-          <w:tblCellMar>
-            <w:top w:w="0" w:type="dxa"/>
-            <w:bottom w:w="0" w:type="dxa"/>
-          </w:tblCellMar>
-        </w:tblPrEx>
         <w:trPr>
           <w:cantSplit/>
         </w:trPr>
@@ -4003,12 +3956,6 @@
         </w:tc>
       </w:tr>
       <w:tr>
-        <w:tblPrEx>
-          <w:tblCellMar>
-            <w:top w:w="0" w:type="dxa"/>
-            <w:bottom w:w="0" w:type="dxa"/>
-          </w:tblCellMar>
-        </w:tblPrEx>
         <w:trPr>
           <w:cantSplit/>
         </w:trPr>
@@ -4078,12 +4025,6 @@
         </w:tc>
       </w:tr>
       <w:tr>
-        <w:tblPrEx>
-          <w:tblCellMar>
-            <w:top w:w="0" w:type="dxa"/>
-            <w:bottom w:w="0" w:type="dxa"/>
-          </w:tblCellMar>
-        </w:tblPrEx>
         <w:trPr>
           <w:cantSplit/>
         </w:trPr>
@@ -4151,12 +4092,6 @@
         </w:tc>
       </w:tr>
       <w:tr>
-        <w:tblPrEx>
-          <w:tblCellMar>
-            <w:top w:w="0" w:type="dxa"/>
-            <w:bottom w:w="0" w:type="dxa"/>
-          </w:tblCellMar>
-        </w:tblPrEx>
         <w:trPr>
           <w:cantSplit/>
         </w:trPr>
@@ -4226,12 +4161,6 @@
         </w:tc>
       </w:tr>
       <w:tr>
-        <w:tblPrEx>
-          <w:tblCellMar>
-            <w:top w:w="0" w:type="dxa"/>
-            <w:bottom w:w="0" w:type="dxa"/>
-          </w:tblCellMar>
-        </w:tblPrEx>
         <w:trPr>
           <w:cantSplit/>
         </w:trPr>
@@ -4300,7 +4229,7 @@
         <w:pStyle w:val="Heading1"/>
         <w:pageBreakBefore/>
       </w:pPr>
-      <w:bookmarkStart w:id="2" w:name="_Toc242087219"/>
+      <w:bookmarkStart w:id="2" w:name="_Toc242087305"/>
       <w:r>
         <w:t>2. Development Approach</w:t>
       </w:r>
@@ -4347,12 +4276,6 @@
         <w:gridCol w:w="2207"/>
       </w:tblGrid>
       <w:tr>
-        <w:tblPrEx>
-          <w:tblCellMar>
-            <w:top w:w="0" w:type="dxa"/>
-            <w:bottom w:w="0" w:type="dxa"/>
-          </w:tblCellMar>
-        </w:tblPrEx>
         <w:trPr>
           <w:tblHeader/>
         </w:trPr>
@@ -4463,12 +4386,6 @@
         </w:tc>
       </w:tr>
       <w:tr>
-        <w:tblPrEx>
-          <w:tblCellMar>
-            <w:top w:w="0" w:type="dxa"/>
-            <w:bottom w:w="0" w:type="dxa"/>
-          </w:tblCellMar>
-        </w:tblPrEx>
         <w:trPr>
           <w:cantSplit/>
         </w:trPr>
@@ -4567,12 +4484,6 @@
         </w:tc>
       </w:tr>
       <w:tr>
-        <w:tblPrEx>
-          <w:tblCellMar>
-            <w:top w:w="0" w:type="dxa"/>
-            <w:bottom w:w="0" w:type="dxa"/>
-          </w:tblCellMar>
-        </w:tblPrEx>
         <w:trPr>
           <w:cantSplit/>
         </w:trPr>
@@ -4674,12 +4585,6 @@
         </w:tc>
       </w:tr>
       <w:tr>
-        <w:tblPrEx>
-          <w:tblCellMar>
-            <w:top w:w="0" w:type="dxa"/>
-            <w:bottom w:w="0" w:type="dxa"/>
-          </w:tblCellMar>
-        </w:tblPrEx>
         <w:trPr>
           <w:cantSplit/>
         </w:trPr>
@@ -4778,12 +4683,6 @@
         </w:tc>
       </w:tr>
       <w:tr>
-        <w:tblPrEx>
-          <w:tblCellMar>
-            <w:top w:w="0" w:type="dxa"/>
-            <w:bottom w:w="0" w:type="dxa"/>
-          </w:tblCellMar>
-        </w:tblPrEx>
         <w:trPr>
           <w:cantSplit/>
         </w:trPr>
@@ -4885,12 +4784,6 @@
         </w:tc>
       </w:tr>
       <w:tr>
-        <w:tblPrEx>
-          <w:tblCellMar>
-            <w:top w:w="0" w:type="dxa"/>
-            <w:bottom w:w="0" w:type="dxa"/>
-          </w:tblCellMar>
-        </w:tblPrEx>
         <w:trPr>
           <w:cantSplit/>
         </w:trPr>
@@ -4989,12 +4882,6 @@
         </w:tc>
       </w:tr>
       <w:tr>
-        <w:tblPrEx>
-          <w:tblCellMar>
-            <w:top w:w="0" w:type="dxa"/>
-            <w:bottom w:w="0" w:type="dxa"/>
-          </w:tblCellMar>
-        </w:tblPrEx>
         <w:trPr>
           <w:cantSplit/>
         </w:trPr>
@@ -5096,12 +4983,6 @@
         </w:tc>
       </w:tr>
       <w:tr>
-        <w:tblPrEx>
-          <w:tblCellMar>
-            <w:top w:w="0" w:type="dxa"/>
-            <w:bottom w:w="0" w:type="dxa"/>
-          </w:tblCellMar>
-        </w:tblPrEx>
         <w:trPr>
           <w:cantSplit/>
         </w:trPr>
@@ -5198,7 +5079,7 @@
       <w:pPr>
         <w:pStyle w:val="Heading2"/>
       </w:pPr>
-      <w:bookmarkStart w:id="3" w:name="_Toc242087220"/>
+      <w:bookmarkStart w:id="3" w:name="_Toc242087306"/>
       <w:r>
         <w:t>2.1 Tools and environment</w:t>
       </w:r>
@@ -5226,12 +5107,6 @@
         <w:gridCol w:w="6018"/>
       </w:tblGrid>
       <w:tr>
-        <w:tblPrEx>
-          <w:tblCellMar>
-            <w:top w:w="0" w:type="dxa"/>
-            <w:bottom w:w="0" w:type="dxa"/>
-          </w:tblCellMar>
-        </w:tblPrEx>
         <w:trPr>
           <w:tblHeader/>
         </w:trPr>
@@ -5307,12 +5182,6 @@
         </w:tc>
       </w:tr>
       <w:tr>
-        <w:tblPrEx>
-          <w:tblCellMar>
-            <w:top w:w="0" w:type="dxa"/>
-            <w:bottom w:w="0" w:type="dxa"/>
-          </w:tblCellMar>
-        </w:tblPrEx>
         <w:trPr>
           <w:cantSplit/>
         </w:trPr>
@@ -5380,12 +5249,6 @@
         </w:tc>
       </w:tr>
       <w:tr>
-        <w:tblPrEx>
-          <w:tblCellMar>
-            <w:top w:w="0" w:type="dxa"/>
-            <w:bottom w:w="0" w:type="dxa"/>
-          </w:tblCellMar>
-        </w:tblPrEx>
         <w:trPr>
           <w:cantSplit/>
         </w:trPr>
@@ -5455,12 +5318,6 @@
         </w:tc>
       </w:tr>
       <w:tr>
-        <w:tblPrEx>
-          <w:tblCellMar>
-            <w:top w:w="0" w:type="dxa"/>
-            <w:bottom w:w="0" w:type="dxa"/>
-          </w:tblCellMar>
-        </w:tblPrEx>
         <w:trPr>
           <w:cantSplit/>
         </w:trPr>
@@ -5528,12 +5385,6 @@
         </w:tc>
       </w:tr>
       <w:tr>
-        <w:tblPrEx>
-          <w:tblCellMar>
-            <w:top w:w="0" w:type="dxa"/>
-            <w:bottom w:w="0" w:type="dxa"/>
-          </w:tblCellMar>
-        </w:tblPrEx>
         <w:trPr>
           <w:cantSplit/>
         </w:trPr>
@@ -5603,12 +5454,6 @@
         </w:tc>
       </w:tr>
       <w:tr>
-        <w:tblPrEx>
-          <w:tblCellMar>
-            <w:top w:w="0" w:type="dxa"/>
-            <w:bottom w:w="0" w:type="dxa"/>
-          </w:tblCellMar>
-        </w:tblPrEx>
         <w:trPr>
           <w:cantSplit/>
         </w:trPr>
@@ -5676,12 +5521,6 @@
         </w:tc>
       </w:tr>
       <w:tr>
-        <w:tblPrEx>
-          <w:tblCellMar>
-            <w:top w:w="0" w:type="dxa"/>
-            <w:bottom w:w="0" w:type="dxa"/>
-          </w:tblCellMar>
-        </w:tblPrEx>
         <w:trPr>
           <w:cantSplit/>
         </w:trPr>
@@ -5751,7 +5590,7 @@
       <w:pPr>
         <w:pStyle w:val="Heading2"/>
       </w:pPr>
-      <w:bookmarkStart w:id="4" w:name="_Toc242087221"/>
+      <w:bookmarkStart w:id="4" w:name="_Toc242087307"/>
       <w:r>
         <w:t>2.2 Coding conventions</w:t>
       </w:r>
@@ -5814,7 +5653,7 @@
         <w:pStyle w:val="Heading1"/>
         <w:pageBreakBefore/>
       </w:pPr>
-      <w:bookmarkStart w:id="5" w:name="_Toc242087222"/>
+      <w:bookmarkStart w:id="5" w:name="_Toc242087308"/>
       <w:r>
         <w:t>3. Technology Stack</w:t>
       </w:r>
@@ -5862,12 +5701,6 @@
         <w:gridCol w:w="4615"/>
       </w:tblGrid>
       <w:tr>
-        <w:tblPrEx>
-          <w:tblCellMar>
-            <w:top w:w="0" w:type="dxa"/>
-            <w:bottom w:w="0" w:type="dxa"/>
-          </w:tblCellMar>
-        </w:tblPrEx>
         <w:trPr>
           <w:tblHeader/>
         </w:trPr>
@@ -6013,12 +5846,6 @@
         </w:tc>
       </w:tr>
       <w:tr>
-        <w:tblPrEx>
-          <w:tblCellMar>
-            <w:top w:w="0" w:type="dxa"/>
-            <w:bottom w:w="0" w:type="dxa"/>
-          </w:tblCellMar>
-        </w:tblPrEx>
         <w:trPr>
           <w:cantSplit/>
         </w:trPr>
@@ -6148,12 +5975,6 @@
         </w:tc>
       </w:tr>
       <w:tr>
-        <w:tblPrEx>
-          <w:tblCellMar>
-            <w:top w:w="0" w:type="dxa"/>
-            <w:bottom w:w="0" w:type="dxa"/>
-          </w:tblCellMar>
-        </w:tblPrEx>
         <w:trPr>
           <w:cantSplit/>
         </w:trPr>
@@ -6287,12 +6108,6 @@
         </w:tc>
       </w:tr>
       <w:tr>
-        <w:tblPrEx>
-          <w:tblCellMar>
-            <w:top w:w="0" w:type="dxa"/>
-            <w:bottom w:w="0" w:type="dxa"/>
-          </w:tblCellMar>
-        </w:tblPrEx>
         <w:trPr>
           <w:cantSplit/>
         </w:trPr>
@@ -6422,12 +6237,6 @@
         </w:tc>
       </w:tr>
       <w:tr>
-        <w:tblPrEx>
-          <w:tblCellMar>
-            <w:top w:w="0" w:type="dxa"/>
-            <w:bottom w:w="0" w:type="dxa"/>
-          </w:tblCellMar>
-        </w:tblPrEx>
         <w:trPr>
           <w:cantSplit/>
         </w:trPr>
@@ -6561,12 +6370,6 @@
         </w:tc>
       </w:tr>
       <w:tr>
-        <w:tblPrEx>
-          <w:tblCellMar>
-            <w:top w:w="0" w:type="dxa"/>
-            <w:bottom w:w="0" w:type="dxa"/>
-          </w:tblCellMar>
-        </w:tblPrEx>
         <w:trPr>
           <w:cantSplit/>
         </w:trPr>
@@ -6696,12 +6499,6 @@
         </w:tc>
       </w:tr>
       <w:tr>
-        <w:tblPrEx>
-          <w:tblCellMar>
-            <w:top w:w="0" w:type="dxa"/>
-            <w:bottom w:w="0" w:type="dxa"/>
-          </w:tblCellMar>
-        </w:tblPrEx>
         <w:trPr>
           <w:cantSplit/>
         </w:trPr>
@@ -6835,12 +6632,6 @@
         </w:tc>
       </w:tr>
       <w:tr>
-        <w:tblPrEx>
-          <w:tblCellMar>
-            <w:top w:w="0" w:type="dxa"/>
-            <w:bottom w:w="0" w:type="dxa"/>
-          </w:tblCellMar>
-        </w:tblPrEx>
         <w:trPr>
           <w:cantSplit/>
         </w:trPr>
@@ -6970,12 +6761,6 @@
         </w:tc>
       </w:tr>
       <w:tr>
-        <w:tblPrEx>
-          <w:tblCellMar>
-            <w:top w:w="0" w:type="dxa"/>
-            <w:bottom w:w="0" w:type="dxa"/>
-          </w:tblCellMar>
-        </w:tblPrEx>
         <w:trPr>
           <w:cantSplit/>
         </w:trPr>
@@ -7109,12 +6894,6 @@
         </w:tc>
       </w:tr>
       <w:tr>
-        <w:tblPrEx>
-          <w:tblCellMar>
-            <w:top w:w="0" w:type="dxa"/>
-            <w:bottom w:w="0" w:type="dxa"/>
-          </w:tblCellMar>
-        </w:tblPrEx>
         <w:trPr>
           <w:cantSplit/>
         </w:trPr>
@@ -7244,12 +7023,6 @@
         </w:tc>
       </w:tr>
       <w:tr>
-        <w:tblPrEx>
-          <w:tblCellMar>
-            <w:top w:w="0" w:type="dxa"/>
-            <w:bottom w:w="0" w:type="dxa"/>
-          </w:tblCellMar>
-        </w:tblPrEx>
         <w:trPr>
           <w:cantSplit/>
         </w:trPr>
@@ -7380,7 +7153,7 @@
         <w:pStyle w:val="Heading1"/>
         <w:pageBreakBefore/>
       </w:pPr>
-      <w:bookmarkStart w:id="6" w:name="_Toc242087223"/>
+      <w:bookmarkStart w:id="6" w:name="_Toc242087309"/>
       <w:r>
         <w:t>4. System Architecture</w:t>
       </w:r>
@@ -7404,7 +7177,7 @@
           <w:noProof/>
         </w:rPr>
         <w:drawing>
-          <wp:inline distT="0" distB="0" distL="0" distR="0" wp14:anchorId="0B237C93" wp14:editId="6B6EBCC3">
+          <wp:inline distT="0" distB="0" distL="0" distR="0" wp14:anchorId="7C1849EC" wp14:editId="4AD8D9DF">
             <wp:extent cx="5734050" cy="3352800"/>
             <wp:effectExtent l="0" t="0" r="0" b="0"/>
             <wp:docPr id="1" name="5-deployment.png" descr="Figure 1 - Deployment architecture" title="Figure 1 - Deployment architecture"/>
@@ -7463,7 +7236,7 @@
       <w:pPr>
         <w:pStyle w:val="Heading2"/>
       </w:pPr>
-      <w:bookmarkStart w:id="7" w:name="_Toc242087224"/>
+      <w:bookmarkStart w:id="7" w:name="_Toc242087310"/>
       <w:r>
         <w:t>4.1 Life of a request</w:t>
       </w:r>
@@ -7546,7 +7319,7 @@
       <w:pPr>
         <w:pStyle w:val="Heading2"/>
       </w:pPr>
-      <w:bookmarkStart w:id="8" w:name="_Toc242087225"/>
+      <w:bookmarkStart w:id="8" w:name="_Toc242087311"/>
       <w:r>
         <w:t>4.2 Project structure</w:t>
       </w:r>
@@ -7590,12 +7363,9 @@
         <w:gridCol w:w="9026"/>
       </w:tblGrid>
       <w:tr>
-        <w:tblPrEx>
-          <w:tblCellMar>
-            <w:top w:w="0" w:type="dxa"/>
-            <w:bottom w:w="0" w:type="dxa"/>
-          </w:tblCellMar>
-        </w:tblPrEx>
+        <w:trPr>
+          <w:cantSplit/>
+        </w:trPr>
         <w:tc>
           <w:tcPr>
             <w:tcW w:w="9026" w:type="dxa"/>
@@ -7878,7 +7648,7 @@
       <w:pPr>
         <w:pStyle w:val="Heading2"/>
       </w:pPr>
-      <w:bookmarkStart w:id="9" w:name="_Toc242087226"/>
+      <w:bookmarkStart w:id="9" w:name="_Toc242087312"/>
       <w:r>
         <w:t>4.3 Module responsibilities</w:t>
       </w:r>
@@ -7906,12 +7676,6 @@
         <w:gridCol w:w="6018"/>
       </w:tblGrid>
       <w:tr>
-        <w:tblPrEx>
-          <w:tblCellMar>
-            <w:top w:w="0" w:type="dxa"/>
-            <w:bottom w:w="0" w:type="dxa"/>
-          </w:tblCellMar>
-        </w:tblPrEx>
         <w:trPr>
           <w:tblHeader/>
         </w:trPr>
@@ -7987,12 +7751,6 @@
         </w:tc>
       </w:tr>
       <w:tr>
-        <w:tblPrEx>
-          <w:tblCellMar>
-            <w:top w:w="0" w:type="dxa"/>
-            <w:bottom w:w="0" w:type="dxa"/>
-          </w:tblCellMar>
-        </w:tblPrEx>
         <w:trPr>
           <w:cantSplit/>
         </w:trPr>
@@ -8060,12 +7818,6 @@
         </w:tc>
       </w:tr>
       <w:tr>
-        <w:tblPrEx>
-          <w:tblCellMar>
-            <w:top w:w="0" w:type="dxa"/>
-            <w:bottom w:w="0" w:type="dxa"/>
-          </w:tblCellMar>
-        </w:tblPrEx>
         <w:trPr>
           <w:cantSplit/>
         </w:trPr>
@@ -8135,12 +7887,6 @@
         </w:tc>
       </w:tr>
       <w:tr>
-        <w:tblPrEx>
-          <w:tblCellMar>
-            <w:top w:w="0" w:type="dxa"/>
-            <w:bottom w:w="0" w:type="dxa"/>
-          </w:tblCellMar>
-        </w:tblPrEx>
         <w:trPr>
           <w:cantSplit/>
         </w:trPr>
@@ -8208,12 +7954,6 @@
         </w:tc>
       </w:tr>
       <w:tr>
-        <w:tblPrEx>
-          <w:tblCellMar>
-            <w:top w:w="0" w:type="dxa"/>
-            <w:bottom w:w="0" w:type="dxa"/>
-          </w:tblCellMar>
-        </w:tblPrEx>
         <w:trPr>
           <w:cantSplit/>
         </w:trPr>
@@ -8283,12 +8023,6 @@
         </w:tc>
       </w:tr>
       <w:tr>
-        <w:tblPrEx>
-          <w:tblCellMar>
-            <w:top w:w="0" w:type="dxa"/>
-            <w:bottom w:w="0" w:type="dxa"/>
-          </w:tblCellMar>
-        </w:tblPrEx>
         <w:trPr>
           <w:cantSplit/>
         </w:trPr>
@@ -8356,12 +8090,6 @@
         </w:tc>
       </w:tr>
       <w:tr>
-        <w:tblPrEx>
-          <w:tblCellMar>
-            <w:top w:w="0" w:type="dxa"/>
-            <w:bottom w:w="0" w:type="dxa"/>
-          </w:tblCellMar>
-        </w:tblPrEx>
         <w:trPr>
           <w:cantSplit/>
         </w:trPr>
@@ -8431,12 +8159,6 @@
         </w:tc>
       </w:tr>
       <w:tr>
-        <w:tblPrEx>
-          <w:tblCellMar>
-            <w:top w:w="0" w:type="dxa"/>
-            <w:bottom w:w="0" w:type="dxa"/>
-          </w:tblCellMar>
-        </w:tblPrEx>
         <w:trPr>
           <w:cantSplit/>
         </w:trPr>
@@ -8504,12 +8226,6 @@
         </w:tc>
       </w:tr>
       <w:tr>
-        <w:tblPrEx>
-          <w:tblCellMar>
-            <w:top w:w="0" w:type="dxa"/>
-            <w:bottom w:w="0" w:type="dxa"/>
-          </w:tblCellMar>
-        </w:tblPrEx>
         <w:trPr>
           <w:cantSplit/>
         </w:trPr>
@@ -8579,12 +8295,6 @@
         </w:tc>
       </w:tr>
       <w:tr>
-        <w:tblPrEx>
-          <w:tblCellMar>
-            <w:top w:w="0" w:type="dxa"/>
-            <w:bottom w:w="0" w:type="dxa"/>
-          </w:tblCellMar>
-        </w:tblPrEx>
         <w:trPr>
           <w:cantSplit/>
         </w:trPr>
@@ -8652,12 +8362,6 @@
         </w:tc>
       </w:tr>
       <w:tr>
-        <w:tblPrEx>
-          <w:tblCellMar>
-            <w:top w:w="0" w:type="dxa"/>
-            <w:bottom w:w="0" w:type="dxa"/>
-          </w:tblCellMar>
-        </w:tblPrEx>
         <w:trPr>
           <w:cantSplit/>
         </w:trPr>
@@ -8727,12 +8431,6 @@
         </w:tc>
       </w:tr>
       <w:tr>
-        <w:tblPrEx>
-          <w:tblCellMar>
-            <w:top w:w="0" w:type="dxa"/>
-            <w:bottom w:w="0" w:type="dxa"/>
-          </w:tblCellMar>
-        </w:tblPrEx>
         <w:trPr>
           <w:cantSplit/>
         </w:trPr>
@@ -8801,7 +8499,7 @@
         <w:pStyle w:val="Heading1"/>
         <w:pageBreakBefore/>
       </w:pPr>
-      <w:bookmarkStart w:id="10" w:name="_Toc242087227"/>
+      <w:bookmarkStart w:id="10" w:name="_Toc242087313"/>
       <w:r>
         <w:t>5. Back-End Implementation</w:t>
       </w:r>
@@ -8811,7 +8509,7 @@
       <w:pPr>
         <w:pStyle w:val="Heading2"/>
       </w:pPr>
-      <w:bookmarkStart w:id="11" w:name="_Toc242087228"/>
+      <w:bookmarkStart w:id="11" w:name="_Toc242087314"/>
       <w:r>
         <w:t>5.1 Application setup</w:t>
       </w:r>
@@ -8863,12 +8561,9 @@
         <w:gridCol w:w="9026"/>
       </w:tblGrid>
       <w:tr>
-        <w:tblPrEx>
-          <w:tblCellMar>
-            <w:top w:w="0" w:type="dxa"/>
-            <w:bottom w:w="0" w:type="dxa"/>
-          </w:tblCellMar>
-        </w:tblPrEx>
+        <w:trPr>
+          <w:cantSplit/>
+        </w:trPr>
         <w:tc>
           <w:tcPr>
             <w:tcW w:w="9026" w:type="dxa"/>
@@ -9041,7 +8736,7 @@
       <w:pPr>
         <w:pStyle w:val="Heading2"/>
       </w:pPr>
-      <w:bookmarkStart w:id="12" w:name="_Toc242087229"/>
+      <w:bookmarkStart w:id="12" w:name="_Toc242087315"/>
       <w:r>
         <w:t>5.2 Data models</w:t>
       </w:r>
@@ -9103,12 +8798,9 @@
         <w:gridCol w:w="9026"/>
       </w:tblGrid>
       <w:tr>
-        <w:tblPrEx>
-          <w:tblCellMar>
-            <w:top w:w="0" w:type="dxa"/>
-            <w:bottom w:w="0" w:type="dxa"/>
-          </w:tblCellMar>
-        </w:tblPrEx>
+        <w:trPr>
+          <w:cantSplit/>
+        </w:trPr>
         <w:tc>
           <w:tcPr>
             <w:tcW w:w="9026" w:type="dxa"/>
@@ -9301,12 +8993,9 @@
         <w:gridCol w:w="9026"/>
       </w:tblGrid>
       <w:tr>
-        <w:tblPrEx>
-          <w:tblCellMar>
-            <w:top w:w="0" w:type="dxa"/>
-            <w:bottom w:w="0" w:type="dxa"/>
-          </w:tblCellMar>
-        </w:tblPrEx>
+        <w:trPr>
+          <w:cantSplit/>
+        </w:trPr>
         <w:tc>
           <w:tcPr>
             <w:tcW w:w="9026" w:type="dxa"/>
@@ -9435,7 +9124,7 @@
       <w:pPr>
         <w:pStyle w:val="Heading2"/>
       </w:pPr>
-      <w:bookmarkStart w:id="13" w:name="_Toc242087230"/>
+      <w:bookmarkStart w:id="13" w:name="_Toc242087316"/>
       <w:r>
         <w:t>5.3 Authentication</w:t>
       </w:r>
@@ -9487,12 +9176,9 @@
         <w:gridCol w:w="9026"/>
       </w:tblGrid>
       <w:tr>
-        <w:tblPrEx>
-          <w:tblCellMar>
-            <w:top w:w="0" w:type="dxa"/>
-            <w:bottom w:w="0" w:type="dxa"/>
-          </w:tblCellMar>
-        </w:tblPrEx>
+        <w:trPr>
+          <w:cantSplit/>
+        </w:trPr>
         <w:tc>
           <w:tcPr>
             <w:tcW w:w="9026" w:type="dxa"/>
@@ -9742,7 +9428,7 @@
       <w:pPr>
         <w:pStyle w:val="Heading2"/>
       </w:pPr>
-      <w:bookmarkStart w:id="14" w:name="_Toc242087231"/>
+      <w:bookmarkStart w:id="14" w:name="_Toc242087359"/>
       <w:r>
         <w:t>5.4 Search and filters</w:t>
       </w:r>
@@ -9794,12 +9480,9 @@
         <w:gridCol w:w="9026"/>
       </w:tblGrid>
       <w:tr>
-        <w:tblPrEx>
-          <w:tblCellMar>
-            <w:top w:w="0" w:type="dxa"/>
-            <w:bottom w:w="0" w:type="dxa"/>
-          </w:tblCellMar>
-        </w:tblPrEx>
+        <w:trPr>
+          <w:cantSplit/>
+        </w:trPr>
         <w:tc>
           <w:tcPr>
             <w:tcW w:w="9026" w:type="dxa"/>
@@ -9961,7 +9644,7 @@
       <w:pPr>
         <w:pStyle w:val="Heading2"/>
       </w:pPr>
-      <w:bookmarkStart w:id="15" w:name="_Toc242087232"/>
+      <w:bookmarkStart w:id="15" w:name="_Toc242087360"/>
       <w:r>
         <w:t>5.5 Contact privacy</w:t>
       </w:r>
@@ -10013,12 +9696,9 @@
         <w:gridCol w:w="9026"/>
       </w:tblGrid>
       <w:tr>
-        <w:tblPrEx>
-          <w:tblCellMar>
-            <w:top w:w="0" w:type="dxa"/>
-            <w:bottom w:w="0" w:type="dxa"/>
-          </w:tblCellMar>
-        </w:tblPrEx>
+        <w:trPr>
+          <w:cantSplit/>
+        </w:trPr>
         <w:tc>
           <w:tcPr>
             <w:tcW w:w="9026" w:type="dxa"/>
@@ -10125,7 +9805,7 @@
       <w:pPr>
         <w:pStyle w:val="Heading2"/>
       </w:pPr>
-      <w:bookmarkStart w:id="16" w:name="_Toc242087233"/>
+      <w:bookmarkStart w:id="16" w:name="_Toc242087361"/>
       <w:r>
         <w:t>5.6 Photo upload</w:t>
       </w:r>
@@ -10177,12 +9857,9 @@
         <w:gridCol w:w="9026"/>
       </w:tblGrid>
       <w:tr>
-        <w:tblPrEx>
-          <w:tblCellMar>
-            <w:top w:w="0" w:type="dxa"/>
-            <w:bottom w:w="0" w:type="dxa"/>
-          </w:tblCellMar>
-        </w:tblPrEx>
+        <w:trPr>
+          <w:cantSplit/>
+        </w:trPr>
         <w:tc>
           <w:tcPr>
             <w:tcW w:w="9026" w:type="dxa"/>
@@ -10476,7 +10153,7 @@
       <w:pPr>
         <w:pStyle w:val="Heading2"/>
       </w:pPr>
-      <w:bookmarkStart w:id="17" w:name="_Toc242087234"/>
+      <w:bookmarkStart w:id="17" w:name="_Toc242087362"/>
       <w:r>
         <w:t>5.7 Claim approval workflow</w:t>
       </w:r>
@@ -10528,12 +10205,9 @@
         <w:gridCol w:w="9026"/>
       </w:tblGrid>
       <w:tr>
-        <w:tblPrEx>
-          <w:tblCellMar>
-            <w:top w:w="0" w:type="dxa"/>
-            <w:bottom w:w="0" w:type="dxa"/>
-          </w:tblCellMar>
-        </w:tblPrEx>
+        <w:trPr>
+          <w:cantSplit/>
+        </w:trPr>
         <w:tc>
           <w:tcPr>
             <w:tcW w:w="9026" w:type="dxa"/>
@@ -10838,7 +10512,7 @@
       <w:pPr>
         <w:pStyle w:val="Heading2"/>
       </w:pPr>
-      <w:bookmarkStart w:id="18" w:name="_Toc242087235"/>
+      <w:bookmarkStart w:id="18" w:name="_Toc242087363"/>
       <w:r>
         <w:t>5.8 Central error handling</w:t>
       </w:r>
@@ -10875,12 +10549,6 @@
         <w:gridCol w:w="4715"/>
       </w:tblGrid>
       <w:tr>
-        <w:tblPrEx>
-          <w:tblCellMar>
-            <w:top w:w="0" w:type="dxa"/>
-            <w:bottom w:w="0" w:type="dxa"/>
-          </w:tblCellMar>
-        </w:tblPrEx>
         <w:trPr>
           <w:tblHeader/>
         </w:trPr>
@@ -10991,12 +10659,6 @@
         </w:tc>
       </w:tr>
       <w:tr>
-        <w:tblPrEx>
-          <w:tblCellMar>
-            <w:top w:w="0" w:type="dxa"/>
-            <w:bottom w:w="0" w:type="dxa"/>
-          </w:tblCellMar>
-        </w:tblPrEx>
         <w:trPr>
           <w:cantSplit/>
         </w:trPr>
@@ -11095,12 +10757,6 @@
         </w:tc>
       </w:tr>
       <w:tr>
-        <w:tblPrEx>
-          <w:tblCellMar>
-            <w:top w:w="0" w:type="dxa"/>
-            <w:bottom w:w="0" w:type="dxa"/>
-          </w:tblCellMar>
-        </w:tblPrEx>
         <w:trPr>
           <w:cantSplit/>
         </w:trPr>
@@ -11202,12 +10858,6 @@
         </w:tc>
       </w:tr>
       <w:tr>
-        <w:tblPrEx>
-          <w:tblCellMar>
-            <w:top w:w="0" w:type="dxa"/>
-            <w:bottom w:w="0" w:type="dxa"/>
-          </w:tblCellMar>
-        </w:tblPrEx>
         <w:trPr>
           <w:cantSplit/>
         </w:trPr>
@@ -11306,12 +10956,6 @@
         </w:tc>
       </w:tr>
       <w:tr>
-        <w:tblPrEx>
-          <w:tblCellMar>
-            <w:top w:w="0" w:type="dxa"/>
-            <w:bottom w:w="0" w:type="dxa"/>
-          </w:tblCellMar>
-        </w:tblPrEx>
         <w:trPr>
           <w:cantSplit/>
         </w:trPr>
@@ -11413,12 +11057,6 @@
         </w:tc>
       </w:tr>
       <w:tr>
-        <w:tblPrEx>
-          <w:tblCellMar>
-            <w:top w:w="0" w:type="dxa"/>
-            <w:bottom w:w="0" w:type="dxa"/>
-          </w:tblCellMar>
-        </w:tblPrEx>
         <w:trPr>
           <w:cantSplit/>
         </w:trPr>
@@ -11517,12 +11155,6 @@
         </w:tc>
       </w:tr>
       <w:tr>
-        <w:tblPrEx>
-          <w:tblCellMar>
-            <w:top w:w="0" w:type="dxa"/>
-            <w:bottom w:w="0" w:type="dxa"/>
-          </w:tblCellMar>
-        </w:tblPrEx>
         <w:trPr>
           <w:cantSplit/>
         </w:trPr>
@@ -11624,12 +11256,6 @@
         </w:tc>
       </w:tr>
       <w:tr>
-        <w:tblPrEx>
-          <w:tblCellMar>
-            <w:top w:w="0" w:type="dxa"/>
-            <w:bottom w:w="0" w:type="dxa"/>
-          </w:tblCellMar>
-        </w:tblPrEx>
         <w:trPr>
           <w:cantSplit/>
         </w:trPr>
@@ -11727,7 +11353,7 @@
         <w:pStyle w:val="Heading1"/>
         <w:pageBreakBefore/>
       </w:pPr>
-      <w:bookmarkStart w:id="19" w:name="_Toc242087236"/>
+      <w:bookmarkStart w:id="19" w:name="_Toc242087364"/>
       <w:r>
         <w:t>6. Front-End Implementation</w:t>
       </w:r>
@@ -11737,7 +11363,7 @@
       <w:pPr>
         <w:pStyle w:val="Heading2"/>
       </w:pPr>
-      <w:bookmarkStart w:id="20" w:name="_Toc242087237"/>
+      <w:bookmarkStart w:id="20" w:name="_Toc242087365"/>
       <w:r>
         <w:t>6.1 Pages and routes</w:t>
       </w:r>
@@ -11767,12 +11393,6 @@
         <w:gridCol w:w="4414"/>
       </w:tblGrid>
       <w:tr>
-        <w:tblPrEx>
-          <w:tblCellMar>
-            <w:top w:w="0" w:type="dxa"/>
-            <w:bottom w:w="0" w:type="dxa"/>
-          </w:tblCellMar>
-        </w:tblPrEx>
         <w:trPr>
           <w:tblHeader/>
         </w:trPr>
@@ -11918,12 +11538,6 @@
         </w:tc>
       </w:tr>
       <w:tr>
-        <w:tblPrEx>
-          <w:tblCellMar>
-            <w:top w:w="0" w:type="dxa"/>
-            <w:bottom w:w="0" w:type="dxa"/>
-          </w:tblCellMar>
-        </w:tblPrEx>
         <w:trPr>
           <w:cantSplit/>
         </w:trPr>
@@ -12054,12 +11668,6 @@
         </w:tc>
       </w:tr>
       <w:tr>
-        <w:tblPrEx>
-          <w:tblCellMar>
-            <w:top w:w="0" w:type="dxa"/>
-            <w:bottom w:w="0" w:type="dxa"/>
-          </w:tblCellMar>
-        </w:tblPrEx>
         <w:trPr>
           <w:cantSplit/>
         </w:trPr>
@@ -12194,12 +11802,6 @@
         </w:tc>
       </w:tr>
       <w:tr>
-        <w:tblPrEx>
-          <w:tblCellMar>
-            <w:top w:w="0" w:type="dxa"/>
-            <w:bottom w:w="0" w:type="dxa"/>
-          </w:tblCellMar>
-        </w:tblPrEx>
         <w:trPr>
           <w:cantSplit/>
         </w:trPr>
@@ -12330,12 +11932,6 @@
         </w:tc>
       </w:tr>
       <w:tr>
-        <w:tblPrEx>
-          <w:tblCellMar>
-            <w:top w:w="0" w:type="dxa"/>
-            <w:bottom w:w="0" w:type="dxa"/>
-          </w:tblCellMar>
-        </w:tblPrEx>
         <w:trPr>
           <w:cantSplit/>
         </w:trPr>
@@ -12470,12 +12066,6 @@
         </w:tc>
       </w:tr>
       <w:tr>
-        <w:tblPrEx>
-          <w:tblCellMar>
-            <w:top w:w="0" w:type="dxa"/>
-            <w:bottom w:w="0" w:type="dxa"/>
-          </w:tblCellMar>
-        </w:tblPrEx>
         <w:trPr>
           <w:cantSplit/>
         </w:trPr>
@@ -12606,12 +12196,6 @@
         </w:tc>
       </w:tr>
       <w:tr>
-        <w:tblPrEx>
-          <w:tblCellMar>
-            <w:top w:w="0" w:type="dxa"/>
-            <w:bottom w:w="0" w:type="dxa"/>
-          </w:tblCellMar>
-        </w:tblPrEx>
         <w:trPr>
           <w:cantSplit/>
         </w:trPr>
@@ -12746,12 +12330,6 @@
         </w:tc>
       </w:tr>
       <w:tr>
-        <w:tblPrEx>
-          <w:tblCellMar>
-            <w:top w:w="0" w:type="dxa"/>
-            <w:bottom w:w="0" w:type="dxa"/>
-          </w:tblCellMar>
-        </w:tblPrEx>
         <w:trPr>
           <w:cantSplit/>
         </w:trPr>
@@ -12878,7 +12456,7 @@
       <w:pPr>
         <w:pStyle w:val="Heading2"/>
       </w:pPr>
-      <w:bookmarkStart w:id="21" w:name="_Toc242087238"/>
+      <w:bookmarkStart w:id="21" w:name="_Toc242087366"/>
       <w:r>
         <w:t>6.2 Talking to the API</w:t>
       </w:r>
@@ -12930,12 +12508,9 @@
         <w:gridCol w:w="9026"/>
       </w:tblGrid>
       <w:tr>
-        <w:tblPrEx>
-          <w:tblCellMar>
-            <w:top w:w="0" w:type="dxa"/>
-            <w:bottom w:w="0" w:type="dxa"/>
-          </w:tblCellMar>
-        </w:tblPrEx>
+        <w:trPr>
+          <w:cantSplit/>
+        </w:trPr>
         <w:tc>
           <w:tcPr>
             <w:tcW w:w="9026" w:type="dxa"/>
@@ -13119,7 +12694,7 @@
       <w:pPr>
         <w:pStyle w:val="Heading2"/>
       </w:pPr>
-      <w:bookmarkStart w:id="22" w:name="_Toc242087239"/>
+      <w:bookmarkStart w:id="22" w:name="_Toc242087367"/>
       <w:r>
         <w:t>6.3 Login state and protected pages</w:t>
       </w:r>
@@ -13171,12 +12746,9 @@
         <w:gridCol w:w="9026"/>
       </w:tblGrid>
       <w:tr>
-        <w:tblPrEx>
-          <w:tblCellMar>
-            <w:top w:w="0" w:type="dxa"/>
-            <w:bottom w:w="0" w:type="dxa"/>
-          </w:tblCellMar>
-        </w:tblPrEx>
+        <w:trPr>
+          <w:cantSplit/>
+        </w:trPr>
         <w:tc>
           <w:tcPr>
             <w:tcW w:w="9026" w:type="dxa"/>
@@ -13305,7 +12877,7 @@
       <w:pPr>
         <w:pStyle w:val="Heading2"/>
       </w:pPr>
-      <w:bookmarkStart w:id="23" w:name="_Toc242087240"/>
+      <w:bookmarkStart w:id="23" w:name="_Toc242087368"/>
       <w:r>
         <w:t>6.4 User-interface design</w:t>
       </w:r>
@@ -13381,7 +12953,7 @@
         <w:pStyle w:val="Heading1"/>
         <w:pageBreakBefore/>
       </w:pPr>
-      <w:bookmarkStart w:id="24" w:name="_Toc242087241"/>
+      <w:bookmarkStart w:id="24" w:name="_Toc242087369"/>
       <w:r>
         <w:t>7. Implemented Functionalities</w:t>
       </w:r>
@@ -13420,12 +12992,6 @@
         <w:gridCol w:w="1406"/>
       </w:tblGrid>
       <w:tr>
-        <w:tblPrEx>
-          <w:tblCellMar>
-            <w:top w:w="0" w:type="dxa"/>
-            <w:bottom w:w="0" w:type="dxa"/>
-          </w:tblCellMar>
-        </w:tblPrEx>
         <w:trPr>
           <w:tblHeader/>
         </w:trPr>
@@ -13606,12 +13172,6 @@
         </w:tc>
       </w:tr>
       <w:tr>
-        <w:tblPrEx>
-          <w:tblCellMar>
-            <w:top w:w="0" w:type="dxa"/>
-            <w:bottom w:w="0" w:type="dxa"/>
-          </w:tblCellMar>
-        </w:tblPrEx>
         <w:trPr>
           <w:cantSplit/>
         </w:trPr>
@@ -13772,12 +13332,6 @@
         </w:tc>
       </w:tr>
       <w:tr>
-        <w:tblPrEx>
-          <w:tblCellMar>
-            <w:top w:w="0" w:type="dxa"/>
-            <w:bottom w:w="0" w:type="dxa"/>
-          </w:tblCellMar>
-        </w:tblPrEx>
         <w:trPr>
           <w:cantSplit/>
         </w:trPr>
@@ -13943,12 +13497,6 @@
         </w:tc>
       </w:tr>
       <w:tr>
-        <w:tblPrEx>
-          <w:tblCellMar>
-            <w:top w:w="0" w:type="dxa"/>
-            <w:bottom w:w="0" w:type="dxa"/>
-          </w:tblCellMar>
-        </w:tblPrEx>
         <w:trPr>
           <w:cantSplit/>
         </w:trPr>
@@ -14109,12 +13657,6 @@
         </w:tc>
       </w:tr>
       <w:tr>
-        <w:tblPrEx>
-          <w:tblCellMar>
-            <w:top w:w="0" w:type="dxa"/>
-            <w:bottom w:w="0" w:type="dxa"/>
-          </w:tblCellMar>
-        </w:tblPrEx>
         <w:trPr>
           <w:cantSplit/>
         </w:trPr>
@@ -14280,12 +13822,6 @@
         </w:tc>
       </w:tr>
       <w:tr>
-        <w:tblPrEx>
-          <w:tblCellMar>
-            <w:top w:w="0" w:type="dxa"/>
-            <w:bottom w:w="0" w:type="dxa"/>
-          </w:tblCellMar>
-        </w:tblPrEx>
         <w:trPr>
           <w:cantSplit/>
         </w:trPr>
@@ -14446,12 +13982,6 @@
         </w:tc>
       </w:tr>
       <w:tr>
-        <w:tblPrEx>
-          <w:tblCellMar>
-            <w:top w:w="0" w:type="dxa"/>
-            <w:bottom w:w="0" w:type="dxa"/>
-          </w:tblCellMar>
-        </w:tblPrEx>
         <w:trPr>
           <w:cantSplit/>
         </w:trPr>
@@ -14617,12 +14147,6 @@
         </w:tc>
       </w:tr>
       <w:tr>
-        <w:tblPrEx>
-          <w:tblCellMar>
-            <w:top w:w="0" w:type="dxa"/>
-            <w:bottom w:w="0" w:type="dxa"/>
-          </w:tblCellMar>
-        </w:tblPrEx>
         <w:trPr>
           <w:cantSplit/>
         </w:trPr>
@@ -14783,12 +14307,6 @@
         </w:tc>
       </w:tr>
       <w:tr>
-        <w:tblPrEx>
-          <w:tblCellMar>
-            <w:top w:w="0" w:type="dxa"/>
-            <w:bottom w:w="0" w:type="dxa"/>
-          </w:tblCellMar>
-        </w:tblPrEx>
         <w:trPr>
           <w:cantSplit/>
         </w:trPr>
@@ -14954,12 +14472,6 @@
         </w:tc>
       </w:tr>
       <w:tr>
-        <w:tblPrEx>
-          <w:tblCellMar>
-            <w:top w:w="0" w:type="dxa"/>
-            <w:bottom w:w="0" w:type="dxa"/>
-          </w:tblCellMar>
-        </w:tblPrEx>
         <w:trPr>
           <w:cantSplit/>
         </w:trPr>
@@ -15120,12 +14632,6 @@
         </w:tc>
       </w:tr>
       <w:tr>
-        <w:tblPrEx>
-          <w:tblCellMar>
-            <w:top w:w="0" w:type="dxa"/>
-            <w:bottom w:w="0" w:type="dxa"/>
-          </w:tblCellMar>
-        </w:tblPrEx>
         <w:trPr>
           <w:cantSplit/>
         </w:trPr>
@@ -15291,12 +14797,6 @@
         </w:tc>
       </w:tr>
       <w:tr>
-        <w:tblPrEx>
-          <w:tblCellMar>
-            <w:top w:w="0" w:type="dxa"/>
-            <w:bottom w:w="0" w:type="dxa"/>
-          </w:tblCellMar>
-        </w:tblPrEx>
         <w:trPr>
           <w:cantSplit/>
         </w:trPr>
@@ -15457,12 +14957,6 @@
         </w:tc>
       </w:tr>
       <w:tr>
-        <w:tblPrEx>
-          <w:tblCellMar>
-            <w:top w:w="0" w:type="dxa"/>
-            <w:bottom w:w="0" w:type="dxa"/>
-          </w:tblCellMar>
-        </w:tblPrEx>
         <w:trPr>
           <w:cantSplit/>
         </w:trPr>
@@ -15628,12 +15122,6 @@
         </w:tc>
       </w:tr>
       <w:tr>
-        <w:tblPrEx>
-          <w:tblCellMar>
-            <w:top w:w="0" w:type="dxa"/>
-            <w:bottom w:w="0" w:type="dxa"/>
-          </w:tblCellMar>
-        </w:tblPrEx>
         <w:trPr>
           <w:cantSplit/>
         </w:trPr>
@@ -15794,12 +15282,6 @@
         </w:tc>
       </w:tr>
       <w:tr>
-        <w:tblPrEx>
-          <w:tblCellMar>
-            <w:top w:w="0" w:type="dxa"/>
-            <w:bottom w:w="0" w:type="dxa"/>
-          </w:tblCellMar>
-        </w:tblPrEx>
         <w:trPr>
           <w:cantSplit/>
         </w:trPr>
@@ -15965,12 +15447,6 @@
         </w:tc>
       </w:tr>
       <w:tr>
-        <w:tblPrEx>
-          <w:tblCellMar>
-            <w:top w:w="0" w:type="dxa"/>
-            <w:bottom w:w="0" w:type="dxa"/>
-          </w:tblCellMar>
-        </w:tblPrEx>
         <w:trPr>
           <w:cantSplit/>
         </w:trPr>
@@ -16131,12 +15607,6 @@
         </w:tc>
       </w:tr>
       <w:tr>
-        <w:tblPrEx>
-          <w:tblCellMar>
-            <w:top w:w="0" w:type="dxa"/>
-            <w:bottom w:w="0" w:type="dxa"/>
-          </w:tblCellMar>
-        </w:tblPrEx>
         <w:trPr>
           <w:cantSplit/>
         </w:trPr>
@@ -16297,7 +15767,7 @@
         <w:pStyle w:val="Heading1"/>
         <w:pageBreakBefore/>
       </w:pPr>
-      <w:bookmarkStart w:id="25" w:name="_Toc242087242"/>
+      <w:bookmarkStart w:id="25" w:name="_Toc242087370"/>
       <w:r>
         <w:t>8. Validation, Error Handling and Security</w:t>
       </w:r>
@@ -16307,7 +15777,7 @@
       <w:pPr>
         <w:pStyle w:val="Heading2"/>
       </w:pPr>
-      <w:bookmarkStart w:id="26" w:name="_Toc242087243"/>
+      <w:bookmarkStart w:id="26" w:name="_Toc242087371"/>
       <w:r>
         <w:t>8.1 Validation on both sides</w:t>
       </w:r>
@@ -16344,12 +15814,6 @@
         <w:gridCol w:w="3210"/>
       </w:tblGrid>
       <w:tr>
-        <w:tblPrEx>
-          <w:tblCellMar>
-            <w:top w:w="0" w:type="dxa"/>
-            <w:bottom w:w="0" w:type="dxa"/>
-          </w:tblCellMar>
-        </w:tblPrEx>
         <w:trPr>
           <w:tblHeader/>
         </w:trPr>
@@ -16460,12 +15924,6 @@
         </w:tc>
       </w:tr>
       <w:tr>
-        <w:tblPrEx>
-          <w:tblCellMar>
-            <w:top w:w="0" w:type="dxa"/>
-            <w:bottom w:w="0" w:type="dxa"/>
-          </w:tblCellMar>
-        </w:tblPrEx>
         <w:trPr>
           <w:cantSplit/>
         </w:trPr>
@@ -16564,12 +16022,6 @@
         </w:tc>
       </w:tr>
       <w:tr>
-        <w:tblPrEx>
-          <w:tblCellMar>
-            <w:top w:w="0" w:type="dxa"/>
-            <w:bottom w:w="0" w:type="dxa"/>
-          </w:tblCellMar>
-        </w:tblPrEx>
         <w:trPr>
           <w:cantSplit/>
         </w:trPr>
@@ -16671,12 +16123,6 @@
         </w:tc>
       </w:tr>
       <w:tr>
-        <w:tblPrEx>
-          <w:tblCellMar>
-            <w:top w:w="0" w:type="dxa"/>
-            <w:bottom w:w="0" w:type="dxa"/>
-          </w:tblCellMar>
-        </w:tblPrEx>
         <w:trPr>
           <w:cantSplit/>
         </w:trPr>
@@ -16775,12 +16221,6 @@
         </w:tc>
       </w:tr>
       <w:tr>
-        <w:tblPrEx>
-          <w:tblCellMar>
-            <w:top w:w="0" w:type="dxa"/>
-            <w:bottom w:w="0" w:type="dxa"/>
-          </w:tblCellMar>
-        </w:tblPrEx>
         <w:trPr>
           <w:cantSplit/>
         </w:trPr>
@@ -16882,12 +16322,6 @@
         </w:tc>
       </w:tr>
       <w:tr>
-        <w:tblPrEx>
-          <w:tblCellMar>
-            <w:top w:w="0" w:type="dxa"/>
-            <w:bottom w:w="0" w:type="dxa"/>
-          </w:tblCellMar>
-        </w:tblPrEx>
         <w:trPr>
           <w:cantSplit/>
         </w:trPr>
@@ -16986,12 +16420,6 @@
         </w:tc>
       </w:tr>
       <w:tr>
-        <w:tblPrEx>
-          <w:tblCellMar>
-            <w:top w:w="0" w:type="dxa"/>
-            <w:bottom w:w="0" w:type="dxa"/>
-          </w:tblCellMar>
-        </w:tblPrEx>
         <w:trPr>
           <w:cantSplit/>
         </w:trPr>
@@ -17093,12 +16521,6 @@
         </w:tc>
       </w:tr>
       <w:tr>
-        <w:tblPrEx>
-          <w:tblCellMar>
-            <w:top w:w="0" w:type="dxa"/>
-            <w:bottom w:w="0" w:type="dxa"/>
-          </w:tblCellMar>
-        </w:tblPrEx>
         <w:trPr>
           <w:cantSplit/>
         </w:trPr>
@@ -17197,12 +16619,6 @@
         </w:tc>
       </w:tr>
       <w:tr>
-        <w:tblPrEx>
-          <w:tblCellMar>
-            <w:top w:w="0" w:type="dxa"/>
-            <w:bottom w:w="0" w:type="dxa"/>
-          </w:tblCellMar>
-        </w:tblPrEx>
         <w:trPr>
           <w:cantSplit/>
         </w:trPr>
@@ -17304,12 +16720,6 @@
         </w:tc>
       </w:tr>
       <w:tr>
-        <w:tblPrEx>
-          <w:tblCellMar>
-            <w:top w:w="0" w:type="dxa"/>
-            <w:bottom w:w="0" w:type="dxa"/>
-          </w:tblCellMar>
-        </w:tblPrEx>
         <w:trPr>
           <w:cantSplit/>
         </w:trPr>
@@ -17408,12 +16818,6 @@
         </w:tc>
       </w:tr>
       <w:tr>
-        <w:tblPrEx>
-          <w:tblCellMar>
-            <w:top w:w="0" w:type="dxa"/>
-            <w:bottom w:w="0" w:type="dxa"/>
-          </w:tblCellMar>
-        </w:tblPrEx>
         <w:trPr>
           <w:cantSplit/>
         </w:trPr>
@@ -17513,7 +16917,7 @@
       <w:pPr>
         <w:pStyle w:val="Heading2"/>
       </w:pPr>
-      <w:bookmarkStart w:id="27" w:name="_Toc242087244"/>
+      <w:bookmarkStart w:id="27" w:name="_Toc242087372"/>
       <w:r>
         <w:t>8.2 Security measures</w:t>
       </w:r>
@@ -17541,12 +16945,6 @@
         <w:gridCol w:w="5617"/>
       </w:tblGrid>
       <w:tr>
-        <w:tblPrEx>
-          <w:tblCellMar>
-            <w:top w:w="0" w:type="dxa"/>
-            <w:bottom w:w="0" w:type="dxa"/>
-          </w:tblCellMar>
-        </w:tblPrEx>
         <w:trPr>
           <w:tblHeader/>
         </w:trPr>
@@ -17622,12 +17020,6 @@
         </w:tc>
       </w:tr>
       <w:tr>
-        <w:tblPrEx>
-          <w:tblCellMar>
-            <w:top w:w="0" w:type="dxa"/>
-            <w:bottom w:w="0" w:type="dxa"/>
-          </w:tblCellMar>
-        </w:tblPrEx>
         <w:trPr>
           <w:cantSplit/>
         </w:trPr>
@@ -17695,12 +17087,6 @@
         </w:tc>
       </w:tr>
       <w:tr>
-        <w:tblPrEx>
-          <w:tblCellMar>
-            <w:top w:w="0" w:type="dxa"/>
-            <w:bottom w:w="0" w:type="dxa"/>
-          </w:tblCellMar>
-        </w:tblPrEx>
         <w:trPr>
           <w:cantSplit/>
         </w:trPr>
@@ -17770,12 +17156,6 @@
         </w:tc>
       </w:tr>
       <w:tr>
-        <w:tblPrEx>
-          <w:tblCellMar>
-            <w:top w:w="0" w:type="dxa"/>
-            <w:bottom w:w="0" w:type="dxa"/>
-          </w:tblCellMar>
-        </w:tblPrEx>
         <w:trPr>
           <w:cantSplit/>
         </w:trPr>
@@ -17843,12 +17223,6 @@
         </w:tc>
       </w:tr>
       <w:tr>
-        <w:tblPrEx>
-          <w:tblCellMar>
-            <w:top w:w="0" w:type="dxa"/>
-            <w:bottom w:w="0" w:type="dxa"/>
-          </w:tblCellMar>
-        </w:tblPrEx>
         <w:trPr>
           <w:cantSplit/>
         </w:trPr>
@@ -17918,12 +17292,6 @@
         </w:tc>
       </w:tr>
       <w:tr>
-        <w:tblPrEx>
-          <w:tblCellMar>
-            <w:top w:w="0" w:type="dxa"/>
-            <w:bottom w:w="0" w:type="dxa"/>
-          </w:tblCellMar>
-        </w:tblPrEx>
         <w:trPr>
           <w:cantSplit/>
         </w:trPr>
@@ -17991,12 +17359,6 @@
         </w:tc>
       </w:tr>
       <w:tr>
-        <w:tblPrEx>
-          <w:tblCellMar>
-            <w:top w:w="0" w:type="dxa"/>
-            <w:bottom w:w="0" w:type="dxa"/>
-          </w:tblCellMar>
-        </w:tblPrEx>
         <w:trPr>
           <w:cantSplit/>
         </w:trPr>
@@ -18066,12 +17428,6 @@
         </w:tc>
       </w:tr>
       <w:tr>
-        <w:tblPrEx>
-          <w:tblCellMar>
-            <w:top w:w="0" w:type="dxa"/>
-            <w:bottom w:w="0" w:type="dxa"/>
-          </w:tblCellMar>
-        </w:tblPrEx>
         <w:trPr>
           <w:cantSplit/>
         </w:trPr>
@@ -18139,12 +17495,6 @@
         </w:tc>
       </w:tr>
       <w:tr>
-        <w:tblPrEx>
-          <w:tblCellMar>
-            <w:top w:w="0" w:type="dxa"/>
-            <w:bottom w:w="0" w:type="dxa"/>
-          </w:tblCellMar>
-        </w:tblPrEx>
         <w:trPr>
           <w:cantSplit/>
         </w:trPr>
@@ -18215,7 +17565,7 @@
         <w:pStyle w:val="Heading1"/>
         <w:pageBreakBefore/>
       </w:pPr>
-      <w:bookmarkStart w:id="28" w:name="_Toc242087245"/>
+      <w:bookmarkStart w:id="28" w:name="_Toc242087373"/>
       <w:r>
         <w:t>9. Demonstration</w:t>
       </w:r>
@@ -18233,7 +17583,7 @@
       <w:pPr>
         <w:pStyle w:val="Heading2"/>
       </w:pPr>
-      <w:bookmarkStart w:id="29" w:name="_Toc242087246"/>
+      <w:bookmarkStart w:id="29" w:name="_Toc242087374"/>
       <w:r>
         <w:t>9.1 Browsing and searching (visitor)</w:t>
       </w:r>
@@ -18249,7 +17599,7 @@
           <w:noProof/>
         </w:rPr>
         <w:drawing>
-          <wp:inline distT="0" distB="0" distL="0" distR="0" wp14:anchorId="124C68DF" wp14:editId="185FF95F">
+          <wp:inline distT="0" distB="0" distL="0" distR="0" wp14:anchorId="7C2B12A7" wp14:editId="1B779E49">
             <wp:extent cx="5734050" cy="6296025"/>
             <wp:effectExtent l="0" t="0" r="0" b="0"/>
             <wp:docPr id="2" name="../screens/01-home.png" descr="Figure 2 - Home page (logged out): statistics, search box, filters and the newest open items" title="Figure 2 - Home page (logged out): statistics, search box, filters and the newest open items"/>
@@ -18314,7 +17664,7 @@
           <w:noProof/>
         </w:rPr>
         <w:drawing>
-          <wp:inline distT="0" distB="0" distL="0" distR="0" wp14:anchorId="34EE7A7E" wp14:editId="3BDE0A77">
+          <wp:inline distT="0" distB="0" distL="0" distR="0" wp14:anchorId="570015AF" wp14:editId="394CB922">
             <wp:extent cx="5667375" cy="3562350"/>
             <wp:effectExtent l="0" t="0" r="0" b="0"/>
             <wp:docPr id="3" name="../screens/02-search.png" descr="Figure 3 - Keyword search for &quot;bottle&quot; - results update as you type" title="Figure 3 - Keyword search for &quot;bottle&quot; - results update as you type"/>
@@ -18379,8 +17729,8 @@
           <w:noProof/>
         </w:rPr>
         <w:drawing>
-          <wp:inline distT="0" distB="0" distL="0" distR="0" wp14:anchorId="50445723" wp14:editId="68CFC6BC">
-            <wp:extent cx="5667375" cy="3562350"/>
+          <wp:inline distT="0" distB="0" distL="0" distR="0" wp14:anchorId="4F673008" wp14:editId="44AA8536">
+            <wp:extent cx="5734050" cy="3009900"/>
             <wp:effectExtent l="0" t="0" r="0" b="0"/>
             <wp:docPr id="4" name="../screens/03-detail-loggedout.png" descr="Figure 4 - Item detail while logged out: poster name shown, contact details hidden" title="Figure 4 - Item detail while logged out: poster name shown, contact details hidden"/>
             <wp:cNvGraphicFramePr>
@@ -18405,7 +17755,7 @@
                   <pic:spPr bwMode="auto">
                     <a:xfrm>
                       <a:off x="0" y="0"/>
-                      <a:ext cx="5667375" cy="3562350"/>
+                      <a:ext cx="5734050" cy="3009900"/>
                     </a:xfrm>
                     <a:prstGeom prst="rect">
                       <a:avLst/>
@@ -18438,7 +17788,7 @@
       <w:pPr>
         <w:pStyle w:val="Heading2"/>
       </w:pPr>
-      <w:bookmarkStart w:id="30" w:name="_Toc242087247"/>
+      <w:bookmarkStart w:id="30" w:name="_Toc242087375"/>
       <w:r>
         <w:t>9.2 Accounts and validation</w:t>
       </w:r>
@@ -18454,8 +17804,8 @@
           <w:noProof/>
         </w:rPr>
         <w:drawing>
-          <wp:inline distT="0" distB="0" distL="0" distR="0" wp14:anchorId="0607FF27" wp14:editId="7BD4415F">
-            <wp:extent cx="5667375" cy="3562350"/>
+          <wp:inline distT="0" distB="0" distL="0" distR="0" wp14:anchorId="5CC54E71" wp14:editId="185F3F7D">
+            <wp:extent cx="5734050" cy="3238500"/>
             <wp:effectExtent l="0" t="0" r="0" b="0"/>
             <wp:docPr id="5" name="../screens/04-login-error.png" descr="Figure 5 - Log in with a wrong password: a generic error message is shown" title="Figure 5 - Log in with a wrong password: a generic error message is shown"/>
             <wp:cNvGraphicFramePr>
@@ -18480,7 +17830,7 @@
                   <pic:spPr bwMode="auto">
                     <a:xfrm>
                       <a:off x="0" y="0"/>
-                      <a:ext cx="5667375" cy="3562350"/>
+                      <a:ext cx="5734050" cy="3238500"/>
                     </a:xfrm>
                     <a:prstGeom prst="rect">
                       <a:avLst/>
@@ -18519,8 +17869,8 @@
           <w:noProof/>
         </w:rPr>
         <w:drawing>
-          <wp:inline distT="0" distB="0" distL="0" distR="0" wp14:anchorId="18DCE149" wp14:editId="6CBB6617">
-            <wp:extent cx="5667375" cy="3562350"/>
+          <wp:inline distT="0" distB="0" distL="0" distR="0" wp14:anchorId="19134A3F" wp14:editId="14141055">
+            <wp:extent cx="5734050" cy="3419475"/>
             <wp:effectExtent l="0" t="0" r="0" b="0"/>
             <wp:docPr id="6" name="../screens/05-register-error.png" descr="Figure 6 - Sign-up with an email that is already registered: clear error message" title="Figure 6 - Sign-up with an email that is already registered: clear error message"/>
             <wp:cNvGraphicFramePr>
@@ -18545,7 +17895,7 @@
                   <pic:spPr bwMode="auto">
                     <a:xfrm>
                       <a:off x="0" y="0"/>
-                      <a:ext cx="5667375" cy="3562350"/>
+                      <a:ext cx="5734050" cy="3419475"/>
                     </a:xfrm>
                     <a:prstGeom prst="rect">
                       <a:avLst/>
@@ -18578,7 +17928,7 @@
       <w:pPr>
         <w:pStyle w:val="Heading2"/>
       </w:pPr>
-      <w:bookmarkStart w:id="31" w:name="_Toc242087248"/>
+      <w:bookmarkStart w:id="31" w:name="_Toc242087376"/>
       <w:r>
         <w:t>9.3 Posting an item</w:t>
       </w:r>
@@ -18594,8 +17944,8 @@
           <w:noProof/>
         </w:rPr>
         <w:drawing>
-          <wp:inline distT="0" distB="0" distL="0" distR="0" wp14:anchorId="6C485F83" wp14:editId="2F8518CE">
-            <wp:extent cx="5734050" cy="5648325"/>
+          <wp:inline distT="0" distB="0" distL="0" distR="0" wp14:anchorId="60C33E41" wp14:editId="3D38385A">
+            <wp:extent cx="5734050" cy="5629275"/>
             <wp:effectExtent l="0" t="0" r="0" b="0"/>
             <wp:docPr id="7" name="../screens/06-post-form.png" descr="Figure 7 - Post an item form, filled in, with the photo preview" title="Figure 7 - Post an item form, filled in, with the photo preview"/>
             <wp:cNvGraphicFramePr>
@@ -18620,7 +17970,7 @@
                   <pic:spPr bwMode="auto">
                     <a:xfrm>
                       <a:off x="0" y="0"/>
-                      <a:ext cx="5734050" cy="5648325"/>
+                      <a:ext cx="5734050" cy="5629275"/>
                     </a:xfrm>
                     <a:prstGeom prst="rect">
                       <a:avLst/>
@@ -18659,8 +18009,8 @@
           <w:noProof/>
         </w:rPr>
         <w:drawing>
-          <wp:inline distT="0" distB="0" distL="0" distR="0" wp14:anchorId="20156630" wp14:editId="6FFE009F">
-            <wp:extent cx="5667375" cy="3562350"/>
+          <wp:inline distT="0" distB="0" distL="0" distR="0" wp14:anchorId="30D6AE63" wp14:editId="36ECCFB3">
+            <wp:extent cx="5734050" cy="3028950"/>
             <wp:effectExtent l="0" t="0" r="0" b="0"/>
             <wp:docPr id="8" name="../screens/07-detail-owner.png" descr="Figure 8 - The new post as seen by its owner: Mark as returned, View requests and Delete post" title="Figure 8 - The new post as seen by its owner: Mark as returned, View requests and Delete post"/>
             <wp:cNvGraphicFramePr>
@@ -18685,7 +18035,7 @@
                   <pic:spPr bwMode="auto">
                     <a:xfrm>
                       <a:off x="0" y="0"/>
-                      <a:ext cx="5667375" cy="3562350"/>
+                      <a:ext cx="5734050" cy="3028950"/>
                     </a:xfrm>
                     <a:prstGeom prst="rect">
                       <a:avLst/>
@@ -18718,7 +18068,7 @@
       <w:pPr>
         <w:pStyle w:val="Heading2"/>
       </w:pPr>
-      <w:bookmarkStart w:id="32" w:name="_Toc242087249"/>
+      <w:bookmarkStart w:id="32" w:name="_Toc242087377"/>
       <w:r>
         <w:t>9.4 Claiming an item</w:t>
       </w:r>
@@ -18734,7 +18084,7 @@
           <w:noProof/>
         </w:rPr>
         <w:drawing>
-          <wp:inline distT="0" distB="0" distL="0" distR="0" wp14:anchorId="7E6AD502" wp14:editId="637ABAAA">
+          <wp:inline distT="0" distB="0" distL="0" distR="0" wp14:anchorId="35E8E7A9" wp14:editId="430C0BDF">
             <wp:extent cx="5667375" cy="3562350"/>
             <wp:effectExtent l="0" t="0" r="0" b="0"/>
             <wp:docPr id="9" name="../screens/08-detail-claim.png" descr="Figure 9 - Logged in as another student: contact details visible and the claim form with proof of ownership" title="Figure 9 - Logged in as another student: contact details visible and the claim form with proof of ownership"/>
@@ -18799,7 +18149,7 @@
           <w:noProof/>
         </w:rPr>
         <w:drawing>
-          <wp:inline distT="0" distB="0" distL="0" distR="0" wp14:anchorId="7657FF38" wp14:editId="28E70407">
+          <wp:inline distT="0" distB="0" distL="0" distR="0" wp14:anchorId="40303CCF" wp14:editId="1599A007">
             <wp:extent cx="5667375" cy="3562350"/>
             <wp:effectExtent l="0" t="0" r="0" b="0"/>
             <wp:docPr id="10" name="../screens/09-claim-sent.png" descr="Figure 10 - After sending the claim: confirmation message" title="Figure 10 - After sending the claim: confirmation message"/>
@@ -18858,7 +18208,7 @@
       <w:pPr>
         <w:pStyle w:val="Heading2"/>
       </w:pPr>
-      <w:bookmarkStart w:id="33" w:name="_Toc242087250"/>
+      <w:bookmarkStart w:id="33" w:name="_Toc242087378"/>
       <w:r>
         <w:t>9.5 Reviewing and approving</w:t>
       </w:r>
@@ -18874,8 +18224,8 @@
           <w:noProof/>
         </w:rPr>
         <w:drawing>
-          <wp:inline distT="0" distB="0" distL="0" distR="0" wp14:anchorId="41923D9C" wp14:editId="225264F0">
-            <wp:extent cx="5667375" cy="3562350"/>
+          <wp:inline distT="0" distB="0" distL="0" distR="0" wp14:anchorId="419CE351" wp14:editId="3AC96BCC">
+            <wp:extent cx="5734050" cy="2314575"/>
             <wp:effectExtent l="0" t="0" r="0" b="0"/>
             <wp:docPr id="11" name="../screens/10-requests-received.png" descr="Figure 11 - Claim requests received by the poster, with the claimant's message and contact, and Approve / Reject buttons" title="Figure 11 - Claim requests received by the poster, with the claimant's message and contact, and Approve / Reject buttons"/>
             <wp:cNvGraphicFramePr>
@@ -18900,7 +18250,7 @@
                   <pic:spPr bwMode="auto">
                     <a:xfrm>
                       <a:off x="0" y="0"/>
-                      <a:ext cx="5667375" cy="3562350"/>
+                      <a:ext cx="5734050" cy="2314575"/>
                     </a:xfrm>
                     <a:prstGeom prst="rect">
                       <a:avLst/>
@@ -18939,8 +18289,8 @@
           <w:noProof/>
         </w:rPr>
         <w:drawing>
-          <wp:inline distT="0" distB="0" distL="0" distR="0" wp14:anchorId="4DF707CE" wp14:editId="18F341A8">
-            <wp:extent cx="5667375" cy="3562350"/>
+          <wp:inline distT="0" distB="0" distL="0" distR="0" wp14:anchorId="5C3954FD" wp14:editId="1E7E4C9F">
+            <wp:extent cx="5734050" cy="2133600"/>
             <wp:effectExtent l="0" t="0" r="0" b="0"/>
             <wp:docPr id="12" name="../screens/11-requests-approved.png" descr="Figure 12 - After approving: the request is approved and the item is marked returned" title="Figure 12 - After approving: the request is approved and the item is marked returned"/>
             <wp:cNvGraphicFramePr>
@@ -18965,7 +18315,7 @@
                   <pic:spPr bwMode="auto">
                     <a:xfrm>
                       <a:off x="0" y="0"/>
-                      <a:ext cx="5667375" cy="3562350"/>
+                      <a:ext cx="5734050" cy="2133600"/>
                     </a:xfrm>
                     <a:prstGeom prst="rect">
                       <a:avLst/>
@@ -19004,8 +18354,8 @@
           <w:noProof/>
         </w:rPr>
         <w:drawing>
-          <wp:inline distT="0" distB="0" distL="0" distR="0" wp14:anchorId="472A7903" wp14:editId="43713DA8">
-            <wp:extent cx="5667375" cy="3562350"/>
+          <wp:inline distT="0" distB="0" distL="0" distR="0" wp14:anchorId="6E4E3A03" wp14:editId="4A148584">
+            <wp:extent cx="5734050" cy="2800350"/>
             <wp:effectExtent l="0" t="0" r="0" b="0"/>
             <wp:docPr id="13" name="../screens/12-requests-sent.png" descr="Figure 13 - The claimant's &quot;Sent&quot; tab shows the request as approved" title="Figure 13 - The claimant's &quot;Sent&quot; tab shows the request as approved"/>
             <wp:cNvGraphicFramePr>
@@ -19030,7 +18380,7 @@
                   <pic:spPr bwMode="auto">
                     <a:xfrm>
                       <a:off x="0" y="0"/>
-                      <a:ext cx="5667375" cy="3562350"/>
+                      <a:ext cx="5734050" cy="2800350"/>
                     </a:xfrm>
                     <a:prstGeom prst="rect">
                       <a:avLst/>
@@ -19069,8 +18419,8 @@
           <w:noProof/>
         </w:rPr>
         <w:drawing>
-          <wp:inline distT="0" distB="0" distL="0" distR="0" wp14:anchorId="6A574081" wp14:editId="305272F9">
-            <wp:extent cx="5667375" cy="3562350"/>
+          <wp:inline distT="0" distB="0" distL="0" distR="0" wp14:anchorId="1052FFAF" wp14:editId="5B27912C">
+            <wp:extent cx="5734050" cy="3009900"/>
             <wp:effectExtent l="0" t="0" r="0" b="0"/>
             <wp:docPr id="14" name="../screens/13-detail-returned.png" descr="Figure 14 - The item now carries the &quot;Returned&quot; tag and can no longer be claimed" title="Figure 14 - The item now carries the &quot;Returned&quot; tag and can no longer be claimed"/>
             <wp:cNvGraphicFramePr>
@@ -19095,7 +18445,7 @@
                   <pic:spPr bwMode="auto">
                     <a:xfrm>
                       <a:off x="0" y="0"/>
-                      <a:ext cx="5667375" cy="3562350"/>
+                      <a:ext cx="5734050" cy="3009900"/>
                     </a:xfrm>
                     <a:prstGeom prst="rect">
                       <a:avLst/>
@@ -19128,7 +18478,7 @@
       <w:pPr>
         <w:pStyle w:val="Heading2"/>
       </w:pPr>
-      <w:bookmarkStart w:id="34" w:name="_Toc242087251"/>
+      <w:bookmarkStart w:id="34" w:name="_Toc242087379"/>
       <w:r>
         <w:t>9.6 My posts and mobile layout</w:t>
       </w:r>
@@ -19144,7 +18494,7 @@
           <w:noProof/>
         </w:rPr>
         <w:drawing>
-          <wp:inline distT="0" distB="0" distL="0" distR="0" wp14:anchorId="661199B0" wp14:editId="4C41EFF8">
+          <wp:inline distT="0" distB="0" distL="0" distR="0" wp14:anchorId="17F93275" wp14:editId="4E117471">
             <wp:extent cx="5667375" cy="3562350"/>
             <wp:effectExtent l="0" t="0" r="0" b="0"/>
             <wp:docPr id="15" name="../screens/14-my-posts.png" descr="Figure 15 - &quot;My posts&quot; for Aarav" title="Figure 15 - &quot;My posts&quot; for Aarav"/>
@@ -19209,8 +18559,8 @@
           <w:noProof/>
         </w:rPr>
         <w:drawing>
-          <wp:inline distT="0" distB="0" distL="0" distR="0" wp14:anchorId="189FE0AD" wp14:editId="487B0FAF">
-            <wp:extent cx="1552575" cy="6762750"/>
+          <wp:inline distT="0" distB="0" distL="0" distR="0" wp14:anchorId="0EACE6E6" wp14:editId="1A22C2D9">
+            <wp:extent cx="1562100" cy="6762750"/>
             <wp:effectExtent l="0" t="0" r="0" b="0"/>
             <wp:docPr id="16" name="../screens/15-mobile.png" descr="Figure 16 - Responsive layout on a phone-sized screen (390 px wide)" title="Figure 16 - Responsive layout on a phone-sized screen (390 px wide)"/>
             <wp:cNvGraphicFramePr>
@@ -19235,7 +18585,7 @@
                   <pic:spPr bwMode="auto">
                     <a:xfrm>
                       <a:off x="0" y="0"/>
-                      <a:ext cx="1552575" cy="6762750"/>
+                      <a:ext cx="1562100" cy="6762750"/>
                     </a:xfrm>
                     <a:prstGeom prst="rect">
                       <a:avLst/>
@@ -19269,7 +18619,7 @@
         <w:pStyle w:val="Heading1"/>
         <w:pageBreakBefore/>
       </w:pPr>
-      <w:bookmarkStart w:id="35" w:name="_Toc242087252"/>
+      <w:bookmarkStart w:id="35" w:name="_Toc242087380"/>
       <w:r>
         <w:t>10. Running the Project</w:t>
       </w:r>
@@ -19279,7 +18629,7 @@
       <w:pPr>
         <w:pStyle w:val="Heading2"/>
       </w:pPr>
-      <w:bookmarkStart w:id="36" w:name="_Toc242087253"/>
+      <w:bookmarkStart w:id="36" w:name="_Toc242087381"/>
       <w:r>
         <w:t>10.1 Requirements</w:t>
       </w:r>
@@ -19328,7 +18678,7 @@
       <w:pPr>
         <w:pStyle w:val="Heading2"/>
       </w:pPr>
-      <w:bookmarkStart w:id="37" w:name="_Toc242087254"/>
+      <w:bookmarkStart w:id="37" w:name="_Toc242087382"/>
       <w:r>
         <w:t>10.2 Steps</w:t>
       </w:r>
@@ -19372,12 +18722,9 @@
         <w:gridCol w:w="9026"/>
       </w:tblGrid>
       <w:tr>
-        <w:tblPrEx>
-          <w:tblCellMar>
-            <w:top w:w="0" w:type="dxa"/>
-            <w:bottom w:w="0" w:type="dxa"/>
-          </w:tblCellMar>
-        </w:tblPrEx>
+        <w:trPr>
+          <w:cantSplit/>
+        </w:trPr>
         <w:tc>
           <w:tcPr>
             <w:tcW w:w="9026" w:type="dxa"/>
@@ -19561,7 +18908,7 @@
       <w:pPr>
         <w:pStyle w:val="Heading2"/>
       </w:pPr>
-      <w:bookmarkStart w:id="38" w:name="_Toc242087255"/>
+      <w:bookmarkStart w:id="38" w:name="_Toc242087383"/>
       <w:r>
         <w:t>10.3 Demo accounts</w:t>
       </w:r>
@@ -19589,12 +18936,6 @@
         <w:gridCol w:w="4012"/>
       </w:tblGrid>
       <w:tr>
-        <w:tblPrEx>
-          <w:tblCellMar>
-            <w:top w:w="0" w:type="dxa"/>
-            <w:bottom w:w="0" w:type="dxa"/>
-          </w:tblCellMar>
-        </w:tblPrEx>
         <w:trPr>
           <w:tblHeader/>
         </w:trPr>
@@ -19670,12 +19011,6 @@
         </w:tc>
       </w:tr>
       <w:tr>
-        <w:tblPrEx>
-          <w:tblCellMar>
-            <w:top w:w="0" w:type="dxa"/>
-            <w:bottom w:w="0" w:type="dxa"/>
-          </w:tblCellMar>
-        </w:tblPrEx>
         <w:trPr>
           <w:cantSplit/>
         </w:trPr>
@@ -19743,12 +19078,6 @@
         </w:tc>
       </w:tr>
       <w:tr>
-        <w:tblPrEx>
-          <w:tblCellMar>
-            <w:top w:w="0" w:type="dxa"/>
-            <w:bottom w:w="0" w:type="dxa"/>
-          </w:tblCellMar>
-        </w:tblPrEx>
         <w:trPr>
           <w:cantSplit/>
         </w:trPr>
@@ -19818,12 +19147,6 @@
         </w:tc>
       </w:tr>
       <w:tr>
-        <w:tblPrEx>
-          <w:tblCellMar>
-            <w:top w:w="0" w:type="dxa"/>
-            <w:bottom w:w="0" w:type="dxa"/>
-          </w:tblCellMar>
-        </w:tblPrEx>
         <w:trPr>
           <w:cantSplit/>
         </w:trPr>
@@ -19892,7 +19215,7 @@
         <w:pStyle w:val="Heading1"/>
         <w:pageBreakBefore/>
       </w:pPr>
-      <w:bookmarkStart w:id="39" w:name="_Toc242087256"/>
+      <w:bookmarkStart w:id="39" w:name="_Toc242087384"/>
       <w:r>
         <w:t>11. Challenges and Solutions</w:t>
       </w:r>
@@ -19920,12 +19243,6 @@
         <w:gridCol w:w="4814"/>
       </w:tblGrid>
       <w:tr>
-        <w:tblPrEx>
-          <w:tblCellMar>
-            <w:top w:w="0" w:type="dxa"/>
-            <w:bottom w:w="0" w:type="dxa"/>
-          </w:tblCellMar>
-        </w:tblPrEx>
         <w:trPr>
           <w:tblHeader/>
         </w:trPr>
@@ -20001,12 +19318,6 @@
         </w:tc>
       </w:tr>
       <w:tr>
-        <w:tblPrEx>
-          <w:tblCellMar>
-            <w:top w:w="0" w:type="dxa"/>
-            <w:bottom w:w="0" w:type="dxa"/>
-          </w:tblCellMar>
-        </w:tblPrEx>
         <w:trPr>
           <w:cantSplit/>
         </w:trPr>
@@ -20074,12 +19385,6 @@
         </w:tc>
       </w:tr>
       <w:tr>
-        <w:tblPrEx>
-          <w:tblCellMar>
-            <w:top w:w="0" w:type="dxa"/>
-            <w:bottom w:w="0" w:type="dxa"/>
-          </w:tblCellMar>
-        </w:tblPrEx>
         <w:trPr>
           <w:cantSplit/>
         </w:trPr>
@@ -20149,12 +19454,6 @@
         </w:tc>
       </w:tr>
       <w:tr>
-        <w:tblPrEx>
-          <w:tblCellMar>
-            <w:top w:w="0" w:type="dxa"/>
-            <w:bottom w:w="0" w:type="dxa"/>
-          </w:tblCellMar>
-        </w:tblPrEx>
         <w:trPr>
           <w:cantSplit/>
         </w:trPr>
@@ -20222,12 +19521,6 @@
         </w:tc>
       </w:tr>
       <w:tr>
-        <w:tblPrEx>
-          <w:tblCellMar>
-            <w:top w:w="0" w:type="dxa"/>
-            <w:bottom w:w="0" w:type="dxa"/>
-          </w:tblCellMar>
-        </w:tblPrEx>
         <w:trPr>
           <w:cantSplit/>
         </w:trPr>
@@ -20297,12 +19590,6 @@
         </w:tc>
       </w:tr>
       <w:tr>
-        <w:tblPrEx>
-          <w:tblCellMar>
-            <w:top w:w="0" w:type="dxa"/>
-            <w:bottom w:w="0" w:type="dxa"/>
-          </w:tblCellMar>
-        </w:tblPrEx>
         <w:trPr>
           <w:cantSplit/>
         </w:trPr>
@@ -20370,12 +19657,6 @@
         </w:tc>
       </w:tr>
       <w:tr>
-        <w:tblPrEx>
-          <w:tblCellMar>
-            <w:top w:w="0" w:type="dxa"/>
-            <w:bottom w:w="0" w:type="dxa"/>
-          </w:tblCellMar>
-        </w:tblPrEx>
         <w:trPr>
           <w:cantSplit/>
         </w:trPr>
@@ -20445,12 +19726,6 @@
         </w:tc>
       </w:tr>
       <w:tr>
-        <w:tblPrEx>
-          <w:tblCellMar>
-            <w:top w:w="0" w:type="dxa"/>
-            <w:bottom w:w="0" w:type="dxa"/>
-          </w:tblCellMar>
-        </w:tblPrEx>
         <w:trPr>
           <w:cantSplit/>
         </w:trPr>
@@ -20519,7 +19794,7 @@
         <w:pStyle w:val="Heading1"/>
         <w:pageBreakBefore/>
       </w:pPr>
-      <w:bookmarkStart w:id="40" w:name="_Toc242087257"/>
+      <w:bookmarkStart w:id="40" w:name="_Toc242087385"/>
       <w:r>
         <w:t>12. Conclusion</w:t>
       </w:r>
@@ -20537,7 +19812,7 @@
       <w:pPr>
         <w:pStyle w:val="Heading2"/>
       </w:pPr>
-      <w:bookmarkStart w:id="41" w:name="_Toc242087258"/>
+      <w:bookmarkStart w:id="41" w:name="_Toc242087386"/>
       <w:r>
         <w:t>Possible improvements</w:t>
       </w:r>
@@ -20761,10 +20036,10 @@
 <file path=word/numbering.xml><?xml version="1.0" encoding="utf-8"?>
 <w:numbering xmlns:wpc="http://schemas.microsoft.com/office/word/2010/wordprocessingCanvas" xmlns:cx="http://schemas.microsoft.com/office/drawing/2014/chartex" xmlns:cx1="http://schemas.microsoft.com/office/drawing/2015/9/8/chartex" xmlns:cx2="http://schemas.microsoft.com/office/drawing/2015/10/21/chartex" xmlns:cx3="http://schemas.microsoft.com/office/drawing/2016/5/9/chartex" xmlns:cx4="http://schemas.microsoft.com/office/drawing/2016/5/10/chartex" xmlns:cx5="http://schemas.microsoft.com/office/drawing/2016/5/11/chartex" xmlns:cx6="http://schemas.microsoft.com/office/drawing/2016/5/12/chartex" xmlns:cx7="http://schemas.microsoft.com/office/drawing/2016/5/13/chartex" xmlns:cx8="http://schemas.microsoft.com/office/drawing/2016/5/14/chartex" xmlns:mc="http://schemas.openxmlformats.org/markup-compatibility/2006" xmlns:aink="http://schemas.microsoft.com/office/drawing/2016/ink" xmlns:am3d="http://schemas.microsoft.com/office/drawing/2017/model3d" xmlns:o="urn:schemas-microsoft-com:office:office" xmlns:oel="http://schemas.microsoft.com/office/2019/extlst" xmlns:r="http://schemas.openxmlformats.org/officeDocument/2006/relationships" xmlns:m="http://schemas.openxmlformats.org/officeDocument/2006/math" xmlns:v="urn:schemas-microsoft-com:vml" xmlns:wp14="http://schemas.microsoft.com/office/word/2010/wordprocessingDrawing" xmlns:wp="http://schemas.openxmlformats.org/drawingml/2006/wordprocessingDrawing" xmlns:w10="urn:schemas-microsoft-com:office:word" xmlns:w="http://schemas.openxmlformats.org/wordprocessingml/2006/main" xmlns:w14="http://schemas.microsoft.com/office/word/2010/wordml" xmlns:w15="http://schemas.microsoft.com/office/word/2012/wordml" xmlns:w16cex="http://schemas.microsoft.com/office/word/2018/wordml/cex" xmlns:w16cid="http://schemas.microsoft.com/office/word/2016/wordml/cid" xmlns:w16="http://schemas.microsoft.com/office/word/2018/wordml" xmlns:w16du="http://schemas.microsoft.com/office/word/2023/wordml/word16du" xmlns:w16sdtdh="http://schemas.microsoft.com/office/word/2020/wordml/sdtdatahash" xmlns:w16sdtfl="http://schemas.microsoft.com/office/word/2024/wordml/sdtformatlock" xmlns:w16se="http://schemas.microsoft.com/office/word/2015/wordml/symex" xmlns:wpg="http://schemas.microsoft.com/office/word/2010/wordprocessingGroup" xmlns:wpi="http://schemas.microsoft.com/office/word/2010/wordprocessingInk" xmlns:wne="http://schemas.microsoft.com/office/word/2006/wordml" xmlns:wps="http://schemas.microsoft.com/office/word/2010/wordprocessingShape" mc:Ignorable="w14 w15 w16se w16cid w16 w16cex w16sdtdh w16sdtfl w16du wp14">
   <w:abstractNum w:abstractNumId="0" w15:restartNumberingAfterBreak="0">
-    <w:nsid w:val="72B02C8B"/>
+    <w:nsid w:val="05D26C52"/>
     <w:multiLevelType w:val="hybridMultilevel"/>
-    <w:tmpl w:val="180CE06E"/>
-    <w:lvl w:ilvl="0" w:tplc="9EBAB426">
+    <w:tmpl w:val="89F06794"/>
+    <w:lvl w:ilvl="0" w:tplc="FE524696">
       <w:start w:val="1"/>
       <w:numFmt w:val="bullet"/>
       <w:lvlText w:val="•"/>
@@ -20773,7 +20048,7 @@
         <w:ind w:left="540" w:hanging="300"/>
       </w:pPr>
     </w:lvl>
-    <w:lvl w:ilvl="1" w:tplc="C2942884" w:tentative="1">
+    <w:lvl w:ilvl="1" w:tplc="769A5332" w:tentative="1">
       <w:start w:val="1"/>
       <w:numFmt w:val="bullet"/>
       <w:lvlText w:val="◦"/>
@@ -20782,47 +20057,47 @@
         <w:ind w:left="1000" w:hanging="300"/>
       </w:pPr>
     </w:lvl>
-    <w:lvl w:ilvl="2" w:tplc="CE24C604">
+    <w:lvl w:ilvl="2" w:tplc="2C32D63E">
       <w:numFmt w:val="decimal"/>
       <w:lvlText w:val=""/>
       <w:lvlJc w:val="left"/>
     </w:lvl>
-    <w:lvl w:ilvl="3" w:tplc="360AA5C4">
+    <w:lvl w:ilvl="3" w:tplc="BEF8A29A">
       <w:numFmt w:val="decimal"/>
       <w:lvlText w:val=""/>
       <w:lvlJc w:val="left"/>
     </w:lvl>
-    <w:lvl w:ilvl="4" w:tplc="C6F2EB06">
+    <w:lvl w:ilvl="4" w:tplc="65803B8C">
       <w:numFmt w:val="decimal"/>
       <w:lvlText w:val=""/>
       <w:lvlJc w:val="left"/>
     </w:lvl>
-    <w:lvl w:ilvl="5" w:tplc="0D76B982">
+    <w:lvl w:ilvl="5" w:tplc="D924F014">
       <w:numFmt w:val="decimal"/>
       <w:lvlText w:val=""/>
       <w:lvlJc w:val="left"/>
     </w:lvl>
-    <w:lvl w:ilvl="6" w:tplc="216687B4">
+    <w:lvl w:ilvl="6" w:tplc="C92AEDD4">
       <w:numFmt w:val="decimal"/>
       <w:lvlText w:val=""/>
       <w:lvlJc w:val="left"/>
     </w:lvl>
-    <w:lvl w:ilvl="7" w:tplc="724C570C">
+    <w:lvl w:ilvl="7" w:tplc="6DFA802E">
       <w:numFmt w:val="decimal"/>
       <w:lvlText w:val=""/>
       <w:lvlJc w:val="left"/>
     </w:lvl>
-    <w:lvl w:ilvl="8" w:tplc="03622CE2">
+    <w:lvl w:ilvl="8" w:tplc="D6949692">
       <w:numFmt w:val="decimal"/>
       <w:lvlText w:val=""/>
       <w:lvlJc w:val="left"/>
     </w:lvl>
   </w:abstractNum>
   <w:abstractNum w:abstractNumId="1" w15:restartNumberingAfterBreak="0">
-    <w:nsid w:val="765E41A9"/>
+    <w:nsid w:val="47F07BB1"/>
     <w:multiLevelType w:val="hybridMultilevel"/>
-    <w:tmpl w:val="D0C807F0"/>
-    <w:lvl w:ilvl="0" w:tplc="DD1C3866" w:tentative="1">
+    <w:tmpl w:val="29AC3022"/>
+    <w:lvl w:ilvl="0" w:tplc="EC3A1096" w:tentative="1">
       <w:start w:val="1"/>
       <w:numFmt w:val="bullet"/>
       <w:lvlText w:val="●"/>
@@ -20831,7 +20106,7 @@
         <w:ind w:left="720" w:hanging="360"/>
       </w:pPr>
     </w:lvl>
-    <w:lvl w:ilvl="1" w:tplc="FA3A1034" w:tentative="1">
+    <w:lvl w:ilvl="1" w:tplc="8DA0DCB8" w:tentative="1">
       <w:start w:val="1"/>
       <w:numFmt w:val="bullet"/>
       <w:lvlText w:val="○"/>
@@ -20840,7 +20115,7 @@
         <w:ind w:left="1440" w:hanging="360"/>
       </w:pPr>
     </w:lvl>
-    <w:lvl w:ilvl="2" w:tplc="03C86CBC" w:tentative="1">
+    <w:lvl w:ilvl="2" w:tplc="19067250" w:tentative="1">
       <w:start w:val="1"/>
       <w:numFmt w:val="bullet"/>
       <w:lvlText w:val="■"/>
@@ -20849,7 +20124,7 @@
         <w:ind w:left="2160" w:hanging="360"/>
       </w:pPr>
     </w:lvl>
-    <w:lvl w:ilvl="3" w:tplc="C7DCB780" w:tentative="1">
+    <w:lvl w:ilvl="3" w:tplc="F564C87C" w:tentative="1">
       <w:start w:val="1"/>
       <w:numFmt w:val="bullet"/>
       <w:lvlText w:val="●"/>
@@ -20858,7 +20133,7 @@
         <w:ind w:left="2880" w:hanging="360"/>
       </w:pPr>
     </w:lvl>
-    <w:lvl w:ilvl="4" w:tplc="614276A6" w:tentative="1">
+    <w:lvl w:ilvl="4" w:tplc="F710D408" w:tentative="1">
       <w:start w:val="1"/>
       <w:numFmt w:val="bullet"/>
       <w:lvlText w:val="○"/>
@@ -20867,7 +20142,7 @@
         <w:ind w:left="3600" w:hanging="360"/>
       </w:pPr>
     </w:lvl>
-    <w:lvl w:ilvl="5" w:tplc="60865F38" w:tentative="1">
+    <w:lvl w:ilvl="5" w:tplc="C2B8A26E" w:tentative="1">
       <w:start w:val="1"/>
       <w:numFmt w:val="bullet"/>
       <w:lvlText w:val="■"/>
@@ -20876,7 +20151,7 @@
         <w:ind w:left="4320" w:hanging="360"/>
       </w:pPr>
     </w:lvl>
-    <w:lvl w:ilvl="6" w:tplc="7E0859EE" w:tentative="1">
+    <w:lvl w:ilvl="6" w:tplc="DE2862E6" w:tentative="1">
       <w:start w:val="1"/>
       <w:numFmt w:val="bullet"/>
       <w:lvlText w:val="●"/>
@@ -20885,7 +20160,7 @@
         <w:ind w:left="5040" w:hanging="360"/>
       </w:pPr>
     </w:lvl>
-    <w:lvl w:ilvl="7" w:tplc="7254A04C" w:tentative="1">
+    <w:lvl w:ilvl="7" w:tplc="9756383E" w:tentative="1">
       <w:start w:val="1"/>
       <w:numFmt w:val="bullet"/>
       <w:lvlText w:val="●"/>
@@ -20894,7 +20169,7 @@
         <w:ind w:left="5760" w:hanging="360"/>
       </w:pPr>
     </w:lvl>
-    <w:lvl w:ilvl="8" w:tplc="F8880892" w:tentative="1">
+    <w:lvl w:ilvl="8" w:tplc="0B32D7B2" w:tentative="1">
       <w:start w:val="1"/>
       <w:numFmt w:val="bullet"/>
       <w:lvlText w:val="●"/>
@@ -20905,10 +20180,10 @@
     </w:lvl>
   </w:abstractNum>
   <w:abstractNum w:abstractNumId="2" w15:restartNumberingAfterBreak="0">
-    <w:nsid w:val="7C40716F"/>
+    <w:nsid w:val="644035EA"/>
     <w:multiLevelType w:val="hybridMultilevel"/>
-    <w:tmpl w:val="DF0EA1C8"/>
-    <w:lvl w:ilvl="0" w:tplc="15B659C6">
+    <w:tmpl w:val="2C668CCC"/>
+    <w:lvl w:ilvl="0" w:tplc="E04C6068">
       <w:start w:val="1"/>
       <w:numFmt w:val="decimal"/>
       <w:lvlText w:val="%1."/>
@@ -20917,60 +20192,60 @@
         <w:ind w:left="540" w:hanging="340"/>
       </w:pPr>
     </w:lvl>
-    <w:lvl w:ilvl="1" w:tplc="749047B4">
+    <w:lvl w:ilvl="1" w:tplc="05D88C68">
       <w:numFmt w:val="decimal"/>
       <w:lvlText w:val=""/>
       <w:lvlJc w:val="left"/>
     </w:lvl>
-    <w:lvl w:ilvl="2" w:tplc="40B249BE">
+    <w:lvl w:ilvl="2" w:tplc="ED28D466">
       <w:numFmt w:val="decimal"/>
       <w:lvlText w:val=""/>
       <w:lvlJc w:val="left"/>
     </w:lvl>
-    <w:lvl w:ilvl="3" w:tplc="7C66BAD2">
+    <w:lvl w:ilvl="3" w:tplc="D172A66C">
       <w:numFmt w:val="decimal"/>
       <w:lvlText w:val=""/>
       <w:lvlJc w:val="left"/>
     </w:lvl>
-    <w:lvl w:ilvl="4" w:tplc="9562426C">
+    <w:lvl w:ilvl="4" w:tplc="21E84022">
       <w:numFmt w:val="decimal"/>
       <w:lvlText w:val=""/>
       <w:lvlJc w:val="left"/>
     </w:lvl>
-    <w:lvl w:ilvl="5" w:tplc="9274F510">
+    <w:lvl w:ilvl="5" w:tplc="EBA0D610">
       <w:numFmt w:val="decimal"/>
       <w:lvlText w:val=""/>
       <w:lvlJc w:val="left"/>
     </w:lvl>
-    <w:lvl w:ilvl="6" w:tplc="27F2F828">
+    <w:lvl w:ilvl="6" w:tplc="E3EECD40">
       <w:numFmt w:val="decimal"/>
       <w:lvlText w:val=""/>
       <w:lvlJc w:val="left"/>
     </w:lvl>
-    <w:lvl w:ilvl="7" w:tplc="E0B2C83C">
+    <w:lvl w:ilvl="7" w:tplc="958CC048">
       <w:numFmt w:val="decimal"/>
       <w:lvlText w:val=""/>
       <w:lvlJc w:val="left"/>
     </w:lvl>
-    <w:lvl w:ilvl="8" w:tplc="5C38458A">
+    <w:lvl w:ilvl="8" w:tplc="1D967B74">
       <w:numFmt w:val="decimal"/>
       <w:lvlText w:val=""/>
       <w:lvlJc w:val="left"/>
     </w:lvl>
   </w:abstractNum>
-  <w:num w:numId="1" w16cid:durableId="1758401485">
+  <w:num w:numId="1" w16cid:durableId="811750458">
     <w:abstractNumId w:val="1"/>
     <w:lvlOverride w:ilvl="0">
       <w:startOverride w:val="1"/>
     </w:lvlOverride>
   </w:num>
-  <w:num w:numId="2" w16cid:durableId="1848210493">
+  <w:num w:numId="2" w16cid:durableId="1680352338">
     <w:abstractNumId w:val="0"/>
     <w:lvlOverride w:ilvl="0">
       <w:startOverride w:val="1"/>
     </w:lvlOverride>
   </w:num>
-  <w:num w:numId="3" w16cid:durableId="1281105356">
+  <w:num w:numId="3" w16cid:durableId="1613055407">
     <w:abstractNumId w:val="2"/>
     <w:lvlOverride w:ilvl="0">
       <w:startOverride w:val="1"/>
@@ -21613,7 +20888,7 @@
     <w:autoRedefine/>
     <w:uiPriority w:val="39"/>
     <w:unhideWhenUsed/>
-    <w:rsid w:val="00CA59C5"/>
+    <w:rsid w:val="00576251"/>
     <w:pPr>
       <w:spacing w:after="100"/>
     </w:pPr>
@@ -21625,7 +20900,7 @@
     <w:autoRedefine/>
     <w:uiPriority w:val="39"/>
     <w:unhideWhenUsed/>
-    <w:rsid w:val="00CA59C5"/>
+    <w:rsid w:val="00576251"/>
     <w:pPr>
       <w:spacing w:after="100"/>
       <w:ind w:left="220"/>

</xml_diff>